<commit_message>
Informe y presentación v2 con resultados E.030 (Random Forest; Gradient Boosting como comparación)
- resumen_e030.py: entrena RF_normalizado con la partición del repositorio de Jean Piere
  (1 200/300 por familia) y lo evalúa una vez en las 300 familias reservadas:
  deriva R² 0,990, MAE 0,040 %, 137 de 146 excedencias (GB: 0,995, 139 de 146)
- Informe v2 (5 págs.): metodología E.030 actualizada, sección 3.2 nueva, discusión y conclusiones
- Presentación v2 (15 diap.): diapositiva E.030, cifras de 1 500 estructuras, tema aplicado sin apply_theme.js
- PDF exportados con Word y PowerPoint; notas del vault actualizadas

Co-Authored-By: Claude Opus 5.5 <noreply@anthropic.com>
</commit_message>
<xml_diff>
--- a/04 Entregables/Informe/Informe_tecnico_Nexo_Sismico.docx
+++ b/04 Entregables/Informe/Informe_tecnico_Nexo_Sismico.docx
@@ -69,7 +69,7 @@
           <w:sz w:val="19"/>
           <w:szCs w:val="19"/>
         </w:rPr>
-        <w:t xml:space="preserve">Comparar alternativas de predimensionamiento sísmico obliga a repetir la preparación de cargas, parámetros normativos y análisis estructurales. Este trabajo plantea un flujo reproducible con dos líneas de evidencia: una base paramétrica generada y analizada en OpenSees bajo la norma peruana E.030 (130 configuraciones en 49 familias) y una ruta colombiana NSR-10 compuesta por un módulo automatizado de verificación y una base de 18 edificios teóricos diseñados con el algoritmo del Prof. T. F. Rojas Vallejo. El módulo NSR-10, probado con un caso correcto, uno incompleto y uno erróneo, reproduce exactamente el cálculo de referencia del edificio del curso (cortante basal de 23,25 MN y derivas máximas de 0,985 % y 0,991 %) y bloquea las entradas defectuosas antes de calcular. Sobre la base NSR-10, con validación dejando una planta completa fuera, Random Forest estimó la deriva máxima con un error absoluto medio de 0,086 % en X y 0,101 % en Y, frente a 0,142 % y 0,166 % de la referencia, con predicciones en 32 ms. Con solo 18 casos el modelo detectó 3 de 7 edificios cercanos al límite, por lo que la herramienta sirve para ordenar alternativas, no para sustituir la verificación.</w:t>
+        <w:t xml:space="preserve">Comparar alternativas de predimensionamiento sísmico obliga a repetir la preparación de cargas, parámetros normativos y análisis estructurales. Este trabajo plantea un flujo reproducible con dos líneas de evidencia que no se mezclan: 1 500 edificios de otras tantas familias generados y analizados en OpenSees bajo la norma peruana E.030, y una ruta colombiana NSR-10 formada por un módulo automatizado de verificación y 18 edificios teóricos diseñados con el algoritmo del Prof. T. F. Rojas Vallejo. En 300 familias E.030 reservadas, Random Forest estimó la deriva máxima con un error absoluto medio de 0,040 % (X) y 0,040 % (Y) de la altura de piso y R² de 0,99, y detectó 137 de los 146 edificios que superan el límite de 0,7 %; Gradient Boosting, usado como comparación, alcanzó R² de 0,995. El módulo NSR-10, probado con un caso correcto, uno incompleto y uno erróneo, reproduce exactamente el cálculo de referencia del edificio del curso (cortante basal de 23,25 MN y derivas de 0,985 % y 0,991 %) y bloquea las entradas defectuosas. Con solo 18 edificios NSR-10 y validación por planta, el error de Random Forest fue de 0,086 % y 0,101 %, 39 % menor que la referencia, pero detectó solo 3 de 7 edificios cercanos al límite. La precisión depende sobre todo de la cantidad de datos trazables y de las variables físicas: la herramienta sirve para filtrar alternativas dentro del dominio entrenado, no para sustituir la verificación.</w:t>
       </w:r>
     </w:p>
     <w:p>
@@ -93,12 +93,13 @@
           <w:sz w:val="19"/>
           <w:szCs w:val="19"/>
         </w:rPr>
-        <w:t xml:space="preserve">deriva sísmica, Random Forest, NSR-10, E.030, OpenSees, automatización, predimensionamiento.</w:t>
+        <w:t xml:space="preserve">deriva sísmica, Random Forest, Gradient Boosting, NSR-10, E.030, OpenSees, automatización, predimensionamiento.</w:t>
       </w:r>
     </w:p>
     <w:p>
       <w:pPr>
         <w:pStyle w:val="Heading1"/>
+        <w:keepNext/>
         <w:spacing w:after="60" w:before="140"/>
       </w:pPr>
       <w:r>
@@ -222,6 +223,7 @@
     <w:p>
       <w:pPr>
         <w:pStyle w:val="Heading1"/>
+        <w:keepNext/>
         <w:spacing w:after="60" w:before="140"/>
       </w:pPr>
       <w:r>
@@ -261,7 +263,7 @@
           <wp:inline distT="0" distB="0" distL="0" distR="0">
             <wp:extent cx="5334000" cy="2066925"/>
             <wp:effectExtent t="0" r="0" b="0" l="0"/>
-            <wp:docPr id="1" name="" descr="" title=""/>
+            <wp:docPr id="1" name=""/>
             <wp:cNvGraphicFramePr>
               <a:graphicFrameLocks xmlns:a="http://schemas.openxmlformats.org/drawingml/2006/main" noChangeAspect="1"/>
             </wp:cNvGraphicFramePr>
@@ -317,6 +319,7 @@
     <w:p>
       <w:pPr>
         <w:pStyle w:val="Heading2"/>
+        <w:keepNext/>
         <w:spacing w:after="40" w:before="90"/>
       </w:pPr>
       <w:r>
@@ -342,12 +345,13 @@
           <w:sz w:val="19"/>
           <w:szCs w:val="19"/>
         </w:rPr>
-        <w:t xml:space="preserve">Un generador en Python crea modelos tridimensionales en OpenSeesPy [3] de edificios regulares de dos a cinco pisos con diafragma rígido y masas por nivel, y los somete a análisis modal espectral según la E.030 [2]. Cada familia conserva el número de pisos y de vanos y varía secciones y cargas; la base actual reúne 130 configuraciones en 49 familias, de las cuales 43 superan el umbral de deriva de 0,007 en al menos un eje. Los modelos no reducen la rigidez por agrietamiento, simplificación que tiende a subestimar periodos y derivas.</w:t>
+        <w:t xml:space="preserve">Un generador en Python [11] crea edificios regulares de concreto armado de dos a cinco pisos, dos a cinco vanos por dirección y luces de 3 a 6 m, con f'c de 210 o 280 kgf/cm², zonas sísmicas Z = 0,10 a 0,45, suelos S0 a S3 y usos comunes o importantes. Predimensiona columnas, vigas y losas con criterios de la E.060, metra cargas según la E.020 y construye en OpenSeesPy [3] un pórtico espacial con secciones brutas y diafragma rígido por piso. El análisis modal espectral sigue la E.030 [2]: combinación CQC, regla direccional 100/30, excentricidad accidental de ±5 %, ajuste al cortante mínimo y deriva normativa igual a la elástica por 0,75·R (R = 8), comparada con 0,007. Se generaron 1 500 estructuras, una por familia y con semilla fija; 668 (45 %) superan el límite en alguna dirección. No se reduce la rigidez por agrietamiento ni se incluye P-Delta, simplificaciones que tienden a subestimar periodos y derivas.</w:t>
       </w:r>
     </w:p>
     <w:p>
       <w:pPr>
         <w:pStyle w:val="Heading2"/>
+        <w:keepNext/>
         <w:spacing w:after="40" w:before="90"/>
       </w:pPr>
       <w:r>
@@ -397,6 +401,7 @@
     <w:p>
       <w:pPr>
         <w:pStyle w:val="Heading2"/>
+        <w:keepNext/>
         <w:spacing w:after="40" w:before="90"/>
       </w:pPr>
       <w:r>
@@ -408,7 +413,7 @@
           <w:sz w:val="20"/>
           <w:szCs w:val="20"/>
         </w:rPr>
-        <w:t xml:space="preserve">2.3 Base de datos NSR-10 y aprendizaje</w:t>
+        <w:t xml:space="preserve">2.3 Aprendizaje en la ruta E.030</w:t>
       </w:r>
     </w:p>
     <w:p>
@@ -422,7 +427,25 @@
           <w:sz w:val="19"/>
           <w:szCs w:val="19"/>
         </w:rPr>
-        <w:t xml:space="preserve">La base une, con un esquema común que registra fuente, norma, programa y estado del dato, 18 edificios diseñados con el algoritmo en OpenSees del Prof. T. F. Rojas Vallejo [8] (DES, suelo lacustre 200 de Bogotá, estructuras regulares) y los casos validados por el módulo. Las entradas de esos edificios (10 plantas regulares con relación de aspecto ≤ 1,5, dos alturas por planta entre 4 y 10 pisos, cargas del Título B y grupo de uso) fueron definidas por el equipo. Según el profesor, estos resultados son de carácter teórico: algunas plantas y luces no se resolverían con pórticos resistentes a momento en la práctica, y las dos configuraciones de la planta P9 se excluyeron por un error de dimensionamiento en el algoritmo.</w:t>
+        <w:t xml:space="preserve">Las estructuras se dividieron por familia en 1200 de desarrollo y 300 reservadas para una prueba final usada una sola vez. Las 107 entradas describen geometría, secciones, cargas, masas y sitio, todas conocidas antes del análisis. Random Forest [4] (scikit-learn [9], 250 árboles, hoja mínima de 1) recibe además variables físicas auxiliares —un periodo aproximado a partir de la rigidez lateral de los pisos y la ordenada espectral de la E.030— y aprende el cociente entre la respuesta de OpenSees y esa estimación. Como comparación se usaron Gradient Boosting [10], el modelo que el repositorio del equipo selecciona por validación cruzada por familias, y la media del entrenamiento. Se reportan MAE, RMSE, R² y la detección de edificios que superan 0,007.</w:t>
+      </w:r>
+    </w:p>
+    <w:p>
+      <w:pPr>
+        <w:pStyle w:val="Heading2"/>
+        <w:keepNext/>
+        <w:spacing w:after="40" w:before="90"/>
+      </w:pPr>
+      <w:r>
+        <w:rPr>
+          <w:rFonts w:ascii="Arial" w:cs="Arial" w:eastAsia="Arial" w:hAnsi="Arial"/>
+          <w:b/>
+          <w:bCs/>
+          <w:color w:val="1F3864"/>
+          <w:sz w:val="20"/>
+          <w:szCs w:val="20"/>
+        </w:rPr>
+        <w:t xml:space="preserve">2.4 Base de datos NSR-10 y aprendizaje</w:t>
       </w:r>
     </w:p>
     <w:p>
@@ -436,12 +459,27 @@
           <w:sz w:val="19"/>
           <w:szCs w:val="19"/>
         </w:rPr>
+        <w:t xml:space="preserve">La base une, con un esquema común que registra fuente, norma, programa y estado del dato, 18 edificios diseñados con el algoritmo en OpenSees del Prof. T. F. Rojas Vallejo [8] (DES, suelo lacustre 200 de Bogotá, estructuras regulares) y los casos validados por el módulo. Las entradas de esos edificios (10 plantas regulares con relación de aspecto ≤ 1,5, dos alturas por planta entre 4 y 10 pisos, cargas del Título B y grupo de uso) fueron definidas por el equipo. Según el profesor, estos resultados son de carácter teórico: algunas plantas y luces no se resolverían con pórticos resistentes a momento en la práctica, y las dos configuraciones de la planta P9 se excluyeron por un error de dimensionamiento en el algoritmo.</w:t>
+      </w:r>
+    </w:p>
+    <w:p>
+      <w:pPr>
+        <w:spacing w:after="70" w:line="252"/>
+        <w:jc w:val="both"/>
+      </w:pPr>
+      <w:r>
+        <w:rPr>
+          <w:rFonts w:ascii="Arial" w:cs="Arial" w:eastAsia="Arial" w:hAnsi="Arial"/>
+          <w:sz w:val="19"/>
+          <w:szCs w:val="19"/>
+        </w:rPr>
         <w:t xml:space="preserve">Se entrenó Random Forest [4] (scikit-learn [9], 500 árboles, hoja mínima de 2, semilla 42) con 13 variables conocidas antes del análisis: altura, pisos, dimensiones y área de planta, número de columnas, luces máxima y media, cargas, coeficiente de importancia, esbeltez y un peso aproximado (área × pisos × carga muerta). Se comparó con una regresión lineal y con una referencia sencilla (Ta = 0,047·H^0,9 para el periodo y la media del entrenamiento para las demás respuestas). La validación dejó fuera una planta completa en cada uno de los 9 pliegues, de modo que las dos alturas de una planta nunca se reparten entre entrenamiento y prueba. Se reportan MAE, RMSE, R², el error porcentual medio y la detección de edificios con deriva ≥ 0,90 %, umbral práctico de revisión.</w:t>
       </w:r>
     </w:p>
     <w:p>
       <w:pPr>
         <w:pStyle w:val="Heading1"/>
+        <w:keepNext/>
         <w:spacing w:after="60" w:before="140"/>
       </w:pPr>
       <w:r>
@@ -459,6 +497,7 @@
     <w:p>
       <w:pPr>
         <w:pStyle w:val="Heading2"/>
+        <w:keepNext/>
         <w:spacing w:after="40" w:before="90"/>
       </w:pPr>
       <w:r>
@@ -498,7 +537,7 @@
           <wp:inline distT="0" distB="0" distL="0" distR="0">
             <wp:extent cx="3143250" cy="1943100"/>
             <wp:effectExtent t="0" r="0" b="0" l="0"/>
-            <wp:docPr id="1" name="" descr="" title=""/>
+            <wp:docPr id="2" name=""/>
             <wp:cNvGraphicFramePr>
               <a:graphicFrameLocks xmlns:a="http://schemas.openxmlformats.org/drawingml/2006/main" noChangeAspect="1"/>
             </wp:cNvGraphicFramePr>
@@ -554,6 +593,7 @@
     <w:p>
       <w:pPr>
         <w:pStyle w:val="Heading2"/>
+        <w:keepNext/>
         <w:spacing w:after="40" w:before="90"/>
       </w:pPr>
       <w:r>
@@ -565,7 +605,7 @@
           <w:sz w:val="20"/>
           <w:szCs w:val="20"/>
         </w:rPr>
-        <w:t xml:space="preserve">3.2 Aprendizaje automático sobre la base NSR-10</w:t>
+        <w:t xml:space="preserve">3.2 Random Forest en familias E.030 reservadas</w:t>
       </w:r>
     </w:p>
     <w:p>
@@ -579,7 +619,7 @@
           <w:sz w:val="19"/>
           <w:szCs w:val="19"/>
         </w:rPr>
-        <w:t xml:space="preserve">La Tabla 1 resume el desempeño en plantas no vistas. Para las derivas, Random Forest redujo el error absoluto medio en 39 % (X) y 39 % (Y) respecto de la referencia y superó a la regresión lineal. Para el periodo y el cortante basal, la regresión lineal sobre variables físicas fue igual o ligeramente mejor, lo que es esperable con 18 casos y relaciones casi proporcionales a la altura y al peso. Ambos modelos mejoraron la fórmula Ta de la norma (error medio de 13,2 % frente a 9,2 % y 7,2 %). Las variables más influyentes en la deriva fueron el número de pisos, la altura y la esbeltez.</w:t>
+        <w:t xml:space="preserve">La Tabla 1 resume la prueba en las 300 familias reservadas. Random Forest estimó la deriva máxima con un MAE de 0,040 % (X) y 0,040 % (Y) y R² de 0,990 y 0,990, frente a un R² nulo al predecir la media, y el periodo con R² de 0,996. De los 146 edificios de prueba que superan 0,007 en alguna dirección, detectó 137 con 2 falsas alarmas; los 9 no detectados tienen derivas reales entre 0,70 % y 0,76 %, justo por encima del límite (Figura 3). Gradient Boosting redujo el MAE de la deriva a 0,026 % y detectó 139 casos: una mejora modesta que indica que el aporte principal proviene de los datos y de las variables físicas más que del algoritmo. Entrenar cada modelo tomó unos 2 s y predecir un edificio, menos de 0,1 s.</w:t>
       </w:r>
     </w:p>
     <w:tbl>
@@ -595,15 +635,15 @@
         </w:tblBorders>
       </w:tblPr>
       <w:tblGrid>
-        <w:gridCol w:w="2300"/>
-        <w:gridCol w:w="2300"/>
-        <w:gridCol w:w="2300"/>
-        <w:gridCol w:w="2300"/>
+        <w:gridCol w:w="2900"/>
+        <w:gridCol w:w="2100"/>
+        <w:gridCol w:w="2100"/>
+        <w:gridCol w:w="2100"/>
       </w:tblGrid>
       <w:tr>
         <w:tc>
           <w:tcPr>
-            <w:tcW w:type="dxa" w:w="2300"/>
+            <w:tcW w:type="dxa" w:w="2900"/>
             <w:tcBorders>
               <w:top w:val="single" w:color="BFBFBF" w:sz="4"/>
               <w:left w:val="single" w:color="BFBFBF" w:sz="4"/>
@@ -631,13 +671,13 @@
                 <w:sz w:val="16"/>
                 <w:szCs w:val="16"/>
               </w:rPr>
-              <w:t xml:space="preserve">Respuesta</w:t>
-            </w:r>
-          </w:p>
-        </w:tc>
-        <w:tc>
-          <w:tcPr>
-            <w:tcW w:type="dxa" w:w="2300"/>
+              <w:t xml:space="preserve">Respuesta (300 familias reservadas)</w:t>
+            </w:r>
+          </w:p>
+        </w:tc>
+        <w:tc>
+          <w:tcPr>
+            <w:tcW w:type="dxa" w:w="2100"/>
             <w:tcBorders>
               <w:top w:val="single" w:color="BFBFBF" w:sz="4"/>
               <w:left w:val="single" w:color="BFBFBF" w:sz="4"/>
@@ -671,7 +711,7 @@
         </w:tc>
         <w:tc>
           <w:tcPr>
-            <w:tcW w:type="dxa" w:w="2300"/>
+            <w:tcW w:type="dxa" w:w="2100"/>
             <w:tcBorders>
               <w:top w:val="single" w:color="BFBFBF" w:sz="4"/>
               <w:left w:val="single" w:color="BFBFBF" w:sz="4"/>
@@ -699,13 +739,13 @@
                 <w:sz w:val="16"/>
                 <w:szCs w:val="16"/>
               </w:rPr>
-              <w:t xml:space="preserve">Regresión lineal MAE · R²</w:t>
-            </w:r>
-          </w:p>
-        </w:tc>
-        <w:tc>
-          <w:tcPr>
-            <w:tcW w:type="dxa" w:w="2300"/>
+              <w:t xml:space="preserve">Gradient Boosting MAE · R²</w:t>
+            </w:r>
+          </w:p>
+        </w:tc>
+        <w:tc>
+          <w:tcPr>
+            <w:tcW w:type="dxa" w:w="2100"/>
             <w:tcBorders>
               <w:top w:val="single" w:color="BFBFBF" w:sz="4"/>
               <w:left w:val="single" w:color="BFBFBF" w:sz="4"/>
@@ -733,7 +773,7 @@
                 <w:sz w:val="16"/>
                 <w:szCs w:val="16"/>
               </w:rPr>
-              <w:t xml:space="preserve">Referencia MAE · R²</w:t>
+              <w:t xml:space="preserve">Media (referencia) MAE · R²</w:t>
             </w:r>
           </w:p>
         </w:tc>
@@ -741,7 +781,7 @@
       <w:tr>
         <w:tc>
           <w:tcPr>
-            <w:tcW w:type="dxa" w:w="2300"/>
+            <w:tcW w:type="dxa" w:w="2900"/>
             <w:tcBorders>
               <w:top w:val="single" w:color="BFBFBF" w:sz="4"/>
               <w:left w:val="single" w:color="BFBFBF" w:sz="4"/>
@@ -774,7 +814,7 @@
         </w:tc>
         <w:tc>
           <w:tcPr>
-            <w:tcW w:type="dxa" w:w="2300"/>
+            <w:tcW w:type="dxa" w:w="2100"/>
             <w:tcBorders>
               <w:top w:val="single" w:color="BFBFBF" w:sz="4"/>
               <w:left w:val="single" w:color="BFBFBF" w:sz="4"/>
@@ -801,13 +841,13 @@
                 <w:sz w:val="16"/>
                 <w:szCs w:val="16"/>
               </w:rPr>
-              <w:t xml:space="preserve">0,070 · 0,79</w:t>
-            </w:r>
-          </w:p>
-        </w:tc>
-        <w:tc>
-          <w:tcPr>
-            <w:tcW w:type="dxa" w:w="2300"/>
+              <w:t xml:space="preserve">0,009 · 0,996</w:t>
+            </w:r>
+          </w:p>
+        </w:tc>
+        <w:tc>
+          <w:tcPr>
+            <w:tcW w:type="dxa" w:w="2100"/>
             <w:tcBorders>
               <w:top w:val="single" w:color="BFBFBF" w:sz="4"/>
               <w:left w:val="single" w:color="BFBFBF" w:sz="4"/>
@@ -834,13 +874,13 @@
                 <w:sz w:val="16"/>
                 <w:szCs w:val="16"/>
               </w:rPr>
-              <w:t xml:space="preserve">0,062 · 0,85</w:t>
-            </w:r>
-          </w:p>
-        </w:tc>
-        <w:tc>
-          <w:tcPr>
-            <w:tcW w:type="dxa" w:w="2300"/>
+              <w:t xml:space="preserve">0,004 · 0,999</w:t>
+            </w:r>
+          </w:p>
+        </w:tc>
+        <w:tc>
+          <w:tcPr>
+            <w:tcW w:type="dxa" w:w="2100"/>
             <w:tcBorders>
               <w:top w:val="single" w:color="BFBFBF" w:sz="4"/>
               <w:left w:val="single" w:color="BFBFBF" w:sz="4"/>
@@ -867,7 +907,7 @@
                 <w:sz w:val="16"/>
                 <w:szCs w:val="16"/>
               </w:rPr>
-              <w:t xml:space="preserve">0,104 · 0,63</w:t>
+              <w:t xml:space="preserve">0,168 · -0,005</w:t>
             </w:r>
           </w:p>
         </w:tc>
@@ -875,7 +915,7 @@
       <w:tr>
         <w:tc>
           <w:tcPr>
-            <w:tcW w:type="dxa" w:w="2300"/>
+            <w:tcW w:type="dxa" w:w="2900"/>
             <w:tcBorders>
               <w:top w:val="single" w:color="BFBFBF" w:sz="4"/>
               <w:left w:val="single" w:color="BFBFBF" w:sz="4"/>
@@ -902,13 +942,13 @@
                 <w:sz w:val="16"/>
                 <w:szCs w:val="16"/>
               </w:rPr>
-              <w:t xml:space="preserve">Cortante Vx (kN)</w:t>
-            </w:r>
-          </w:p>
-        </w:tc>
-        <w:tc>
-          <w:tcPr>
-            <w:tcW w:type="dxa" w:w="2300"/>
+              <w:t xml:space="preserve">Deriva máx. X (%)</w:t>
+            </w:r>
+          </w:p>
+        </w:tc>
+        <w:tc>
+          <w:tcPr>
+            <w:tcW w:type="dxa" w:w="2100"/>
             <w:tcBorders>
               <w:top w:val="single" w:color="BFBFBF" w:sz="4"/>
               <w:left w:val="single" w:color="BFBFBF" w:sz="4"/>
@@ -935,13 +975,13 @@
                 <w:sz w:val="16"/>
                 <w:szCs w:val="16"/>
               </w:rPr>
-              <w:t xml:space="preserve">2601 · 0,65</w:t>
-            </w:r>
-          </w:p>
-        </w:tc>
-        <w:tc>
-          <w:tcPr>
-            <w:tcW w:type="dxa" w:w="2300"/>
+              <w:t xml:space="preserve">0,040 · 0,990</w:t>
+            </w:r>
+          </w:p>
+        </w:tc>
+        <w:tc>
+          <w:tcPr>
+            <w:tcW w:type="dxa" w:w="2100"/>
             <w:tcBorders>
               <w:top w:val="single" w:color="BFBFBF" w:sz="4"/>
               <w:left w:val="single" w:color="BFBFBF" w:sz="4"/>
@@ -968,13 +1008,13 @@
                 <w:sz w:val="16"/>
                 <w:szCs w:val="16"/>
               </w:rPr>
-              <w:t xml:space="preserve">2399 · 0,66</w:t>
-            </w:r>
-          </w:p>
-        </w:tc>
-        <w:tc>
-          <w:tcPr>
-            <w:tcW w:type="dxa" w:w="2300"/>
+              <w:t xml:space="preserve">0,026 · 0,995</w:t>
+            </w:r>
+          </w:p>
+        </w:tc>
+        <w:tc>
+          <w:tcPr>
+            <w:tcW w:type="dxa" w:w="2100"/>
             <w:tcBorders>
               <w:top w:val="single" w:color="BFBFBF" w:sz="4"/>
               <w:left w:val="single" w:color="BFBFBF" w:sz="4"/>
@@ -1001,7 +1041,7 @@
                 <w:sz w:val="16"/>
                 <w:szCs w:val="16"/>
               </w:rPr>
-              <w:t xml:space="preserve">4766 · -0,08</w:t>
+              <w:t xml:space="preserve">0,472 · -0,004</w:t>
             </w:r>
           </w:p>
         </w:tc>
@@ -1009,7 +1049,7 @@
       <w:tr>
         <w:tc>
           <w:tcPr>
-            <w:tcW w:type="dxa" w:w="2300"/>
+            <w:tcW w:type="dxa" w:w="2900"/>
             <w:tcBorders>
               <w:top w:val="single" w:color="BFBFBF" w:sz="4"/>
               <w:left w:val="single" w:color="BFBFBF" w:sz="4"/>
@@ -1036,13 +1076,13 @@
                 <w:sz w:val="16"/>
                 <w:szCs w:val="16"/>
               </w:rPr>
-              <w:t xml:space="preserve">Deriva máx. X (%)</w:t>
-            </w:r>
-          </w:p>
-        </w:tc>
-        <w:tc>
-          <w:tcPr>
-            <w:tcW w:type="dxa" w:w="2300"/>
+              <w:t xml:space="preserve">Deriva máx. Y (%)</w:t>
+            </w:r>
+          </w:p>
+        </w:tc>
+        <w:tc>
+          <w:tcPr>
+            <w:tcW w:type="dxa" w:w="2100"/>
             <w:tcBorders>
               <w:top w:val="single" w:color="BFBFBF" w:sz="4"/>
               <w:left w:val="single" w:color="BFBFBF" w:sz="4"/>
@@ -1069,13 +1109,13 @@
                 <w:sz w:val="16"/>
                 <w:szCs w:val="16"/>
               </w:rPr>
-              <w:t xml:space="preserve">0,086 · 0,59</w:t>
-            </w:r>
-          </w:p>
-        </w:tc>
-        <w:tc>
-          <w:tcPr>
-            <w:tcW w:type="dxa" w:w="2300"/>
+              <w:t xml:space="preserve">0,040 · 0,990</w:t>
+            </w:r>
+          </w:p>
+        </w:tc>
+        <w:tc>
+          <w:tcPr>
+            <w:tcW w:type="dxa" w:w="2100"/>
             <w:tcBorders>
               <w:top w:val="single" w:color="BFBFBF" w:sz="4"/>
               <w:left w:val="single" w:color="BFBFBF" w:sz="4"/>
@@ -1102,13 +1142,13 @@
                 <w:sz w:val="16"/>
                 <w:szCs w:val="16"/>
               </w:rPr>
-              <w:t xml:space="preserve">0,094 · 0,53</w:t>
-            </w:r>
-          </w:p>
-        </w:tc>
-        <w:tc>
-          <w:tcPr>
-            <w:tcW w:type="dxa" w:w="2300"/>
+              <w:t xml:space="preserve">0,026 · 0,995</w:t>
+            </w:r>
+          </w:p>
+        </w:tc>
+        <w:tc>
+          <w:tcPr>
+            <w:tcW w:type="dxa" w:w="2100"/>
             <w:tcBorders>
               <w:top w:val="single" w:color="BFBFBF" w:sz="4"/>
               <w:left w:val="single" w:color="BFBFBF" w:sz="4"/>
@@ -1135,7 +1175,7 @@
                 <w:sz w:val="16"/>
                 <w:szCs w:val="16"/>
               </w:rPr>
-              <w:t xml:space="preserve">0,142 · -0,13</w:t>
+              <w:t xml:space="preserve">0,476 · -0,005</w:t>
             </w:r>
           </w:p>
         </w:tc>
@@ -1143,7 +1183,7 @@
       <w:tr>
         <w:tc>
           <w:tcPr>
-            <w:tcW w:type="dxa" w:w="2300"/>
+            <w:tcW w:type="dxa" w:w="2900"/>
             <w:tcBorders>
               <w:top w:val="single" w:color="BFBFBF" w:sz="4"/>
               <w:left w:val="single" w:color="BFBFBF" w:sz="4"/>
@@ -1170,13 +1210,13 @@
                 <w:sz w:val="16"/>
                 <w:szCs w:val="16"/>
               </w:rPr>
-              <w:t xml:space="preserve">Deriva máx. Y (%)</w:t>
-            </w:r>
-          </w:p>
-        </w:tc>
-        <w:tc>
-          <w:tcPr>
-            <w:tcW w:type="dxa" w:w="2300"/>
+              <w:t xml:space="preserve">Excedencias detectadas (X o Y)</w:t>
+            </w:r>
+          </w:p>
+        </w:tc>
+        <w:tc>
+          <w:tcPr>
+            <w:tcW w:type="dxa" w:w="2100"/>
             <w:tcBorders>
               <w:top w:val="single" w:color="BFBFBF" w:sz="4"/>
               <w:left w:val="single" w:color="BFBFBF" w:sz="4"/>
@@ -1203,13 +1243,13 @@
                 <w:sz w:val="16"/>
                 <w:szCs w:val="16"/>
               </w:rPr>
-              <w:t xml:space="preserve">0,101 · 0,42</w:t>
-            </w:r>
-          </w:p>
-        </w:tc>
-        <w:tc>
-          <w:tcPr>
-            <w:tcW w:type="dxa" w:w="2300"/>
+              <w:t xml:space="preserve">137 de 146 · 2 falsas alarmas</w:t>
+            </w:r>
+          </w:p>
+        </w:tc>
+        <w:tc>
+          <w:tcPr>
+            <w:tcW w:type="dxa" w:w="2100"/>
             <w:tcBorders>
               <w:top w:val="single" w:color="BFBFBF" w:sz="4"/>
               <w:left w:val="single" w:color="BFBFBF" w:sz="4"/>
@@ -1236,13 +1276,13 @@
                 <w:sz w:val="16"/>
                 <w:szCs w:val="16"/>
               </w:rPr>
-              <w:t xml:space="preserve">0,130 · 0,11</w:t>
-            </w:r>
-          </w:p>
-        </w:tc>
-        <w:tc>
-          <w:tcPr>
-            <w:tcW w:type="dxa" w:w="2300"/>
+              <w:t xml:space="preserve">139 de 146 · 2 falsas alarmas</w:t>
+            </w:r>
+          </w:p>
+        </w:tc>
+        <w:tc>
+          <w:tcPr>
+            <w:tcW w:type="dxa" w:w="2100"/>
             <w:tcBorders>
               <w:top w:val="single" w:color="BFBFBF" w:sz="4"/>
               <w:left w:val="single" w:color="BFBFBF" w:sz="4"/>
@@ -1269,7 +1309,7 @@
                 <w:sz w:val="16"/>
                 <w:szCs w:val="16"/>
               </w:rPr>
-              <w:t xml:space="preserve">0,166 · -0,15</w:t>
+              <w:t xml:space="preserve">—</w:t>
             </w:r>
           </w:p>
         </w:tc>
@@ -1289,7 +1329,7 @@
           <w:sz w:val="16"/>
           <w:szCs w:val="16"/>
         </w:rPr>
-        <w:t xml:space="preserve">Tabla 1. Error absoluto medio (MAE) y R² con validación dejando una planta fuera (18 edificios, 9 plantas). Derivas en % de la altura de piso.</w:t>
+        <w:t xml:space="preserve">Tabla 1. Prueba única en 300 familias E.030 no vistas (1 200 de desarrollo). Derivas en % de la altura de piso.</w:t>
       </w:r>
     </w:p>
     <w:p>
@@ -1301,9 +1341,9 @@
       <w:r>
         <w:drawing>
           <wp:inline distT="0" distB="0" distL="0" distR="0">
-            <wp:extent cx="5334000" cy="2362200"/>
+            <wp:extent cx="4953000" cy="2200275"/>
             <wp:effectExtent t="0" r="0" b="0" l="0"/>
-            <wp:docPr id="1" name="" descr="" title=""/>
+            <wp:docPr id="3" name=""/>
             <wp:cNvGraphicFramePr>
               <a:graphicFrameLocks xmlns:a="http://schemas.openxmlformats.org/drawingml/2006/main" noChangeAspect="1"/>
             </wp:cNvGraphicFramePr>
@@ -1326,6 +1366,812 @@
                   <pic:spPr bwMode="auto">
                     <a:xfrm>
                       <a:off x="0" y="0"/>
+                      <a:ext cx="4953000" cy="2200275"/>
+                    </a:xfrm>
+                    <a:prstGeom prst="rect">
+                      <a:avLst/>
+                    </a:prstGeom>
+                  </pic:spPr>
+                </pic:pic>
+              </a:graphicData>
+            </a:graphic>
+          </wp:inline>
+        </w:drawing>
+      </w:r>
+    </w:p>
+    <w:p>
+      <w:pPr>
+        <w:spacing w:after="90"/>
+        <w:jc w:val="center"/>
+      </w:pPr>
+      <w:r>
+        <w:rPr>
+          <w:rFonts w:ascii="Arial" w:cs="Arial" w:eastAsia="Arial" w:hAnsi="Arial"/>
+          <w:i/>
+          <w:iCs/>
+          <w:color w:val="555555"/>
+          <w:sz w:val="16"/>
+          <w:szCs w:val="16"/>
+        </w:rPr>
+        <w:t xml:space="preserve">Figura 3. Deriva calculada (OpenSees) frente a predicha por Random Forest en 300 familias E.030 reservadas.</w:t>
+      </w:r>
+    </w:p>
+    <w:p>
+      <w:pPr>
+        <w:pStyle w:val="Heading2"/>
+        <w:keepNext/>
+        <w:spacing w:after="40" w:before="90"/>
+      </w:pPr>
+      <w:r>
+        <w:rPr>
+          <w:rFonts w:ascii="Arial" w:cs="Arial" w:eastAsia="Arial" w:hAnsi="Arial"/>
+          <w:b/>
+          <w:bCs/>
+          <w:color w:val="1F3864"/>
+          <w:sz w:val="20"/>
+          <w:szCs w:val="20"/>
+        </w:rPr>
+        <w:t xml:space="preserve">3.3 Random Forest sobre la base NSR-10</w:t>
+      </w:r>
+    </w:p>
+    <w:p>
+      <w:pPr>
+        <w:spacing w:after="70" w:line="252"/>
+        <w:jc w:val="both"/>
+      </w:pPr>
+      <w:r>
+        <w:rPr>
+          <w:rFonts w:ascii="Arial" w:cs="Arial" w:eastAsia="Arial" w:hAnsi="Arial"/>
+          <w:sz w:val="19"/>
+          <w:szCs w:val="19"/>
+        </w:rPr>
+        <w:t xml:space="preserve">La Tabla 2 resume el desempeño en plantas no vistas. Para las derivas, Random Forest redujo el error absoluto medio en 39 % (X) y 39 % (Y) respecto de la referencia y superó a la regresión lineal. Para el periodo y el cortante basal, la regresión lineal sobre variables físicas fue igual o ligeramente mejor, lo que es esperable con 18 casos y relaciones casi proporcionales a la altura y al peso. Ambos modelos mejoraron la fórmula Ta de la norma (error medio de 13,2 % frente a 9,2 % y 7,2 %). Las variables más influyentes en la deriva fueron el número de pisos, la altura y la esbeltez.</w:t>
+      </w:r>
+    </w:p>
+    <w:tbl>
+      <w:tblPr>
+        <w:tblW w:type="dxa" w:w="9200"/>
+        <w:tblBorders>
+          <w:top w:val="single" w:color="auto" w:sz="4"/>
+          <w:left w:val="single" w:color="auto" w:sz="4"/>
+          <w:bottom w:val="single" w:color="auto" w:sz="4"/>
+          <w:right w:val="single" w:color="auto" w:sz="4"/>
+          <w:insideH w:val="single" w:color="auto" w:sz="4"/>
+          <w:insideV w:val="single" w:color="auto" w:sz="4"/>
+        </w:tblBorders>
+      </w:tblPr>
+      <w:tblGrid>
+        <w:gridCol w:w="2300"/>
+        <w:gridCol w:w="2300"/>
+        <w:gridCol w:w="2300"/>
+        <w:gridCol w:w="2300"/>
+      </w:tblGrid>
+      <w:tr>
+        <w:tc>
+          <w:tcPr>
+            <w:tcW w:type="dxa" w:w="2300"/>
+            <w:tcBorders>
+              <w:top w:val="single" w:color="BFBFBF" w:sz="4"/>
+              <w:left w:val="single" w:color="BFBFBF" w:sz="4"/>
+              <w:bottom w:val="single" w:color="BFBFBF" w:sz="4"/>
+              <w:right w:val="single" w:color="BFBFBF" w:sz="4"/>
+            </w:tcBorders>
+            <w:shd w:fill="1F3864" w:color="auto" w:val="clear"/>
+            <w:tcMar>
+              <w:top w:type="dxa" w:w="40"/>
+              <w:left w:type="dxa" w:w="80"/>
+              <w:bottom w:type="dxa" w:w="40"/>
+              <w:right w:type="dxa" w:w="80"/>
+            </w:tcMar>
+          </w:tcPr>
+          <w:p>
+            <w:pPr>
+              <w:jc w:val="left"/>
+            </w:pPr>
+            <w:r>
+              <w:rPr>
+                <w:rFonts w:ascii="Arial" w:cs="Arial" w:eastAsia="Arial" w:hAnsi="Arial"/>
+                <w:b/>
+                <w:bCs/>
+                <w:color w:val="FFFFFF"/>
+                <w:sz w:val="16"/>
+                <w:szCs w:val="16"/>
+              </w:rPr>
+              <w:t xml:space="preserve">Respuesta</w:t>
+            </w:r>
+          </w:p>
+        </w:tc>
+        <w:tc>
+          <w:tcPr>
+            <w:tcW w:type="dxa" w:w="2300"/>
+            <w:tcBorders>
+              <w:top w:val="single" w:color="BFBFBF" w:sz="4"/>
+              <w:left w:val="single" w:color="BFBFBF" w:sz="4"/>
+              <w:bottom w:val="single" w:color="BFBFBF" w:sz="4"/>
+              <w:right w:val="single" w:color="BFBFBF" w:sz="4"/>
+            </w:tcBorders>
+            <w:shd w:fill="1F3864" w:color="auto" w:val="clear"/>
+            <w:tcMar>
+              <w:top w:type="dxa" w:w="40"/>
+              <w:left w:type="dxa" w:w="80"/>
+              <w:bottom w:type="dxa" w:w="40"/>
+              <w:right w:type="dxa" w:w="80"/>
+            </w:tcMar>
+          </w:tcPr>
+          <w:p>
+            <w:pPr>
+              <w:jc w:val="center"/>
+            </w:pPr>
+            <w:r>
+              <w:rPr>
+                <w:rFonts w:ascii="Arial" w:cs="Arial" w:eastAsia="Arial" w:hAnsi="Arial"/>
+                <w:b/>
+                <w:bCs/>
+                <w:color w:val="FFFFFF"/>
+                <w:sz w:val="16"/>
+                <w:szCs w:val="16"/>
+              </w:rPr>
+              <w:t xml:space="preserve">Random Forest MAE · R²</w:t>
+            </w:r>
+          </w:p>
+        </w:tc>
+        <w:tc>
+          <w:tcPr>
+            <w:tcW w:type="dxa" w:w="2300"/>
+            <w:tcBorders>
+              <w:top w:val="single" w:color="BFBFBF" w:sz="4"/>
+              <w:left w:val="single" w:color="BFBFBF" w:sz="4"/>
+              <w:bottom w:val="single" w:color="BFBFBF" w:sz="4"/>
+              <w:right w:val="single" w:color="BFBFBF" w:sz="4"/>
+            </w:tcBorders>
+            <w:shd w:fill="1F3864" w:color="auto" w:val="clear"/>
+            <w:tcMar>
+              <w:top w:type="dxa" w:w="40"/>
+              <w:left w:type="dxa" w:w="80"/>
+              <w:bottom w:type="dxa" w:w="40"/>
+              <w:right w:type="dxa" w:w="80"/>
+            </w:tcMar>
+          </w:tcPr>
+          <w:p>
+            <w:pPr>
+              <w:jc w:val="center"/>
+            </w:pPr>
+            <w:r>
+              <w:rPr>
+                <w:rFonts w:ascii="Arial" w:cs="Arial" w:eastAsia="Arial" w:hAnsi="Arial"/>
+                <w:b/>
+                <w:bCs/>
+                <w:color w:val="FFFFFF"/>
+                <w:sz w:val="16"/>
+                <w:szCs w:val="16"/>
+              </w:rPr>
+              <w:t xml:space="preserve">Regresión lineal MAE · R²</w:t>
+            </w:r>
+          </w:p>
+        </w:tc>
+        <w:tc>
+          <w:tcPr>
+            <w:tcW w:type="dxa" w:w="2300"/>
+            <w:tcBorders>
+              <w:top w:val="single" w:color="BFBFBF" w:sz="4"/>
+              <w:left w:val="single" w:color="BFBFBF" w:sz="4"/>
+              <w:bottom w:val="single" w:color="BFBFBF" w:sz="4"/>
+              <w:right w:val="single" w:color="BFBFBF" w:sz="4"/>
+            </w:tcBorders>
+            <w:shd w:fill="1F3864" w:color="auto" w:val="clear"/>
+            <w:tcMar>
+              <w:top w:type="dxa" w:w="40"/>
+              <w:left w:type="dxa" w:w="80"/>
+              <w:bottom w:type="dxa" w:w="40"/>
+              <w:right w:type="dxa" w:w="80"/>
+            </w:tcMar>
+          </w:tcPr>
+          <w:p>
+            <w:pPr>
+              <w:jc w:val="center"/>
+            </w:pPr>
+            <w:r>
+              <w:rPr>
+                <w:rFonts w:ascii="Arial" w:cs="Arial" w:eastAsia="Arial" w:hAnsi="Arial"/>
+                <w:b/>
+                <w:bCs/>
+                <w:color w:val="FFFFFF"/>
+                <w:sz w:val="16"/>
+                <w:szCs w:val="16"/>
+              </w:rPr>
+              <w:t xml:space="preserve">Referencia MAE · R²</w:t>
+            </w:r>
+          </w:p>
+        </w:tc>
+      </w:tr>
+      <w:tr>
+        <w:tc>
+          <w:tcPr>
+            <w:tcW w:type="dxa" w:w="2300"/>
+            <w:tcBorders>
+              <w:top w:val="single" w:color="BFBFBF" w:sz="4"/>
+              <w:left w:val="single" w:color="BFBFBF" w:sz="4"/>
+              <w:bottom w:val="single" w:color="BFBFBF" w:sz="4"/>
+              <w:right w:val="single" w:color="BFBFBF" w:sz="4"/>
+            </w:tcBorders>
+            <w:tcMar>
+              <w:top w:type="dxa" w:w="40"/>
+              <w:left w:type="dxa" w:w="80"/>
+              <w:bottom w:type="dxa" w:w="40"/>
+              <w:right w:type="dxa" w:w="80"/>
+            </w:tcMar>
+          </w:tcPr>
+          <w:p>
+            <w:pPr>
+              <w:jc w:val="left"/>
+            </w:pPr>
+            <w:r>
+              <w:rPr>
+                <w:rFonts w:ascii="Arial" w:cs="Arial" w:eastAsia="Arial" w:hAnsi="Arial"/>
+                <w:b w:val="false"/>
+                <w:bCs w:val="false"/>
+                <w:color w:val="000000"/>
+                <w:sz w:val="16"/>
+                <w:szCs w:val="16"/>
+              </w:rPr>
+              <w:t xml:space="preserve">Periodo Tx (s)</w:t>
+            </w:r>
+          </w:p>
+        </w:tc>
+        <w:tc>
+          <w:tcPr>
+            <w:tcW w:type="dxa" w:w="2300"/>
+            <w:tcBorders>
+              <w:top w:val="single" w:color="BFBFBF" w:sz="4"/>
+              <w:left w:val="single" w:color="BFBFBF" w:sz="4"/>
+              <w:bottom w:val="single" w:color="BFBFBF" w:sz="4"/>
+              <w:right w:val="single" w:color="BFBFBF" w:sz="4"/>
+            </w:tcBorders>
+            <w:tcMar>
+              <w:top w:type="dxa" w:w="40"/>
+              <w:left w:type="dxa" w:w="80"/>
+              <w:bottom w:type="dxa" w:w="40"/>
+              <w:right w:type="dxa" w:w="80"/>
+            </w:tcMar>
+          </w:tcPr>
+          <w:p>
+            <w:pPr>
+              <w:jc w:val="center"/>
+            </w:pPr>
+            <w:r>
+              <w:rPr>
+                <w:rFonts w:ascii="Arial" w:cs="Arial" w:eastAsia="Arial" w:hAnsi="Arial"/>
+                <w:b w:val="false"/>
+                <w:bCs w:val="false"/>
+                <w:color w:val="000000"/>
+                <w:sz w:val="16"/>
+                <w:szCs w:val="16"/>
+              </w:rPr>
+              <w:t xml:space="preserve">0,070 · 0,79</w:t>
+            </w:r>
+          </w:p>
+        </w:tc>
+        <w:tc>
+          <w:tcPr>
+            <w:tcW w:type="dxa" w:w="2300"/>
+            <w:tcBorders>
+              <w:top w:val="single" w:color="BFBFBF" w:sz="4"/>
+              <w:left w:val="single" w:color="BFBFBF" w:sz="4"/>
+              <w:bottom w:val="single" w:color="BFBFBF" w:sz="4"/>
+              <w:right w:val="single" w:color="BFBFBF" w:sz="4"/>
+            </w:tcBorders>
+            <w:tcMar>
+              <w:top w:type="dxa" w:w="40"/>
+              <w:left w:type="dxa" w:w="80"/>
+              <w:bottom w:type="dxa" w:w="40"/>
+              <w:right w:type="dxa" w:w="80"/>
+            </w:tcMar>
+          </w:tcPr>
+          <w:p>
+            <w:pPr>
+              <w:jc w:val="center"/>
+            </w:pPr>
+            <w:r>
+              <w:rPr>
+                <w:rFonts w:ascii="Arial" w:cs="Arial" w:eastAsia="Arial" w:hAnsi="Arial"/>
+                <w:b w:val="false"/>
+                <w:bCs w:val="false"/>
+                <w:color w:val="000000"/>
+                <w:sz w:val="16"/>
+                <w:szCs w:val="16"/>
+              </w:rPr>
+              <w:t xml:space="preserve">0,062 · 0,85</w:t>
+            </w:r>
+          </w:p>
+        </w:tc>
+        <w:tc>
+          <w:tcPr>
+            <w:tcW w:type="dxa" w:w="2300"/>
+            <w:tcBorders>
+              <w:top w:val="single" w:color="BFBFBF" w:sz="4"/>
+              <w:left w:val="single" w:color="BFBFBF" w:sz="4"/>
+              <w:bottom w:val="single" w:color="BFBFBF" w:sz="4"/>
+              <w:right w:val="single" w:color="BFBFBF" w:sz="4"/>
+            </w:tcBorders>
+            <w:tcMar>
+              <w:top w:type="dxa" w:w="40"/>
+              <w:left w:type="dxa" w:w="80"/>
+              <w:bottom w:type="dxa" w:w="40"/>
+              <w:right w:type="dxa" w:w="80"/>
+            </w:tcMar>
+          </w:tcPr>
+          <w:p>
+            <w:pPr>
+              <w:jc w:val="center"/>
+            </w:pPr>
+            <w:r>
+              <w:rPr>
+                <w:rFonts w:ascii="Arial" w:cs="Arial" w:eastAsia="Arial" w:hAnsi="Arial"/>
+                <w:b w:val="false"/>
+                <w:bCs w:val="false"/>
+                <w:color w:val="000000"/>
+                <w:sz w:val="16"/>
+                <w:szCs w:val="16"/>
+              </w:rPr>
+              <w:t xml:space="preserve">0,104 · 0,63</w:t>
+            </w:r>
+          </w:p>
+        </w:tc>
+      </w:tr>
+      <w:tr>
+        <w:tc>
+          <w:tcPr>
+            <w:tcW w:type="dxa" w:w="2300"/>
+            <w:tcBorders>
+              <w:top w:val="single" w:color="BFBFBF" w:sz="4"/>
+              <w:left w:val="single" w:color="BFBFBF" w:sz="4"/>
+              <w:bottom w:val="single" w:color="BFBFBF" w:sz="4"/>
+              <w:right w:val="single" w:color="BFBFBF" w:sz="4"/>
+            </w:tcBorders>
+            <w:tcMar>
+              <w:top w:type="dxa" w:w="40"/>
+              <w:left w:type="dxa" w:w="80"/>
+              <w:bottom w:type="dxa" w:w="40"/>
+              <w:right w:type="dxa" w:w="80"/>
+            </w:tcMar>
+          </w:tcPr>
+          <w:p>
+            <w:pPr>
+              <w:jc w:val="left"/>
+            </w:pPr>
+            <w:r>
+              <w:rPr>
+                <w:rFonts w:ascii="Arial" w:cs="Arial" w:eastAsia="Arial" w:hAnsi="Arial"/>
+                <w:b w:val="false"/>
+                <w:bCs w:val="false"/>
+                <w:color w:val="000000"/>
+                <w:sz w:val="16"/>
+                <w:szCs w:val="16"/>
+              </w:rPr>
+              <w:t xml:space="preserve">Cortante Vx (kN)</w:t>
+            </w:r>
+          </w:p>
+        </w:tc>
+        <w:tc>
+          <w:tcPr>
+            <w:tcW w:type="dxa" w:w="2300"/>
+            <w:tcBorders>
+              <w:top w:val="single" w:color="BFBFBF" w:sz="4"/>
+              <w:left w:val="single" w:color="BFBFBF" w:sz="4"/>
+              <w:bottom w:val="single" w:color="BFBFBF" w:sz="4"/>
+              <w:right w:val="single" w:color="BFBFBF" w:sz="4"/>
+            </w:tcBorders>
+            <w:tcMar>
+              <w:top w:type="dxa" w:w="40"/>
+              <w:left w:type="dxa" w:w="80"/>
+              <w:bottom w:type="dxa" w:w="40"/>
+              <w:right w:type="dxa" w:w="80"/>
+            </w:tcMar>
+          </w:tcPr>
+          <w:p>
+            <w:pPr>
+              <w:jc w:val="center"/>
+            </w:pPr>
+            <w:r>
+              <w:rPr>
+                <w:rFonts w:ascii="Arial" w:cs="Arial" w:eastAsia="Arial" w:hAnsi="Arial"/>
+                <w:b w:val="false"/>
+                <w:bCs w:val="false"/>
+                <w:color w:val="000000"/>
+                <w:sz w:val="16"/>
+                <w:szCs w:val="16"/>
+              </w:rPr>
+              <w:t xml:space="preserve">2601 · 0,65</w:t>
+            </w:r>
+          </w:p>
+        </w:tc>
+        <w:tc>
+          <w:tcPr>
+            <w:tcW w:type="dxa" w:w="2300"/>
+            <w:tcBorders>
+              <w:top w:val="single" w:color="BFBFBF" w:sz="4"/>
+              <w:left w:val="single" w:color="BFBFBF" w:sz="4"/>
+              <w:bottom w:val="single" w:color="BFBFBF" w:sz="4"/>
+              <w:right w:val="single" w:color="BFBFBF" w:sz="4"/>
+            </w:tcBorders>
+            <w:tcMar>
+              <w:top w:type="dxa" w:w="40"/>
+              <w:left w:type="dxa" w:w="80"/>
+              <w:bottom w:type="dxa" w:w="40"/>
+              <w:right w:type="dxa" w:w="80"/>
+            </w:tcMar>
+          </w:tcPr>
+          <w:p>
+            <w:pPr>
+              <w:jc w:val="center"/>
+            </w:pPr>
+            <w:r>
+              <w:rPr>
+                <w:rFonts w:ascii="Arial" w:cs="Arial" w:eastAsia="Arial" w:hAnsi="Arial"/>
+                <w:b w:val="false"/>
+                <w:bCs w:val="false"/>
+                <w:color w:val="000000"/>
+                <w:sz w:val="16"/>
+                <w:szCs w:val="16"/>
+              </w:rPr>
+              <w:t xml:space="preserve">2399 · 0,66</w:t>
+            </w:r>
+          </w:p>
+        </w:tc>
+        <w:tc>
+          <w:tcPr>
+            <w:tcW w:type="dxa" w:w="2300"/>
+            <w:tcBorders>
+              <w:top w:val="single" w:color="BFBFBF" w:sz="4"/>
+              <w:left w:val="single" w:color="BFBFBF" w:sz="4"/>
+              <w:bottom w:val="single" w:color="BFBFBF" w:sz="4"/>
+              <w:right w:val="single" w:color="BFBFBF" w:sz="4"/>
+            </w:tcBorders>
+            <w:tcMar>
+              <w:top w:type="dxa" w:w="40"/>
+              <w:left w:type="dxa" w:w="80"/>
+              <w:bottom w:type="dxa" w:w="40"/>
+              <w:right w:type="dxa" w:w="80"/>
+            </w:tcMar>
+          </w:tcPr>
+          <w:p>
+            <w:pPr>
+              <w:jc w:val="center"/>
+            </w:pPr>
+            <w:r>
+              <w:rPr>
+                <w:rFonts w:ascii="Arial" w:cs="Arial" w:eastAsia="Arial" w:hAnsi="Arial"/>
+                <w:b w:val="false"/>
+                <w:bCs w:val="false"/>
+                <w:color w:val="000000"/>
+                <w:sz w:val="16"/>
+                <w:szCs w:val="16"/>
+              </w:rPr>
+              <w:t xml:space="preserve">4766 · -0,08</w:t>
+            </w:r>
+          </w:p>
+        </w:tc>
+      </w:tr>
+      <w:tr>
+        <w:tc>
+          <w:tcPr>
+            <w:tcW w:type="dxa" w:w="2300"/>
+            <w:tcBorders>
+              <w:top w:val="single" w:color="BFBFBF" w:sz="4"/>
+              <w:left w:val="single" w:color="BFBFBF" w:sz="4"/>
+              <w:bottom w:val="single" w:color="BFBFBF" w:sz="4"/>
+              <w:right w:val="single" w:color="BFBFBF" w:sz="4"/>
+            </w:tcBorders>
+            <w:tcMar>
+              <w:top w:type="dxa" w:w="40"/>
+              <w:left w:type="dxa" w:w="80"/>
+              <w:bottom w:type="dxa" w:w="40"/>
+              <w:right w:type="dxa" w:w="80"/>
+            </w:tcMar>
+          </w:tcPr>
+          <w:p>
+            <w:pPr>
+              <w:jc w:val="left"/>
+            </w:pPr>
+            <w:r>
+              <w:rPr>
+                <w:rFonts w:ascii="Arial" w:cs="Arial" w:eastAsia="Arial" w:hAnsi="Arial"/>
+                <w:b w:val="false"/>
+                <w:bCs w:val="false"/>
+                <w:color w:val="000000"/>
+                <w:sz w:val="16"/>
+                <w:szCs w:val="16"/>
+              </w:rPr>
+              <w:t xml:space="preserve">Deriva máx. X (%)</w:t>
+            </w:r>
+          </w:p>
+        </w:tc>
+        <w:tc>
+          <w:tcPr>
+            <w:tcW w:type="dxa" w:w="2300"/>
+            <w:tcBorders>
+              <w:top w:val="single" w:color="BFBFBF" w:sz="4"/>
+              <w:left w:val="single" w:color="BFBFBF" w:sz="4"/>
+              <w:bottom w:val="single" w:color="BFBFBF" w:sz="4"/>
+              <w:right w:val="single" w:color="BFBFBF" w:sz="4"/>
+            </w:tcBorders>
+            <w:tcMar>
+              <w:top w:type="dxa" w:w="40"/>
+              <w:left w:type="dxa" w:w="80"/>
+              <w:bottom w:type="dxa" w:w="40"/>
+              <w:right w:type="dxa" w:w="80"/>
+            </w:tcMar>
+          </w:tcPr>
+          <w:p>
+            <w:pPr>
+              <w:jc w:val="center"/>
+            </w:pPr>
+            <w:r>
+              <w:rPr>
+                <w:rFonts w:ascii="Arial" w:cs="Arial" w:eastAsia="Arial" w:hAnsi="Arial"/>
+                <w:b w:val="false"/>
+                <w:bCs w:val="false"/>
+                <w:color w:val="000000"/>
+                <w:sz w:val="16"/>
+                <w:szCs w:val="16"/>
+              </w:rPr>
+              <w:t xml:space="preserve">0,086 · 0,59</w:t>
+            </w:r>
+          </w:p>
+        </w:tc>
+        <w:tc>
+          <w:tcPr>
+            <w:tcW w:type="dxa" w:w="2300"/>
+            <w:tcBorders>
+              <w:top w:val="single" w:color="BFBFBF" w:sz="4"/>
+              <w:left w:val="single" w:color="BFBFBF" w:sz="4"/>
+              <w:bottom w:val="single" w:color="BFBFBF" w:sz="4"/>
+              <w:right w:val="single" w:color="BFBFBF" w:sz="4"/>
+            </w:tcBorders>
+            <w:tcMar>
+              <w:top w:type="dxa" w:w="40"/>
+              <w:left w:type="dxa" w:w="80"/>
+              <w:bottom w:type="dxa" w:w="40"/>
+              <w:right w:type="dxa" w:w="80"/>
+            </w:tcMar>
+          </w:tcPr>
+          <w:p>
+            <w:pPr>
+              <w:jc w:val="center"/>
+            </w:pPr>
+            <w:r>
+              <w:rPr>
+                <w:rFonts w:ascii="Arial" w:cs="Arial" w:eastAsia="Arial" w:hAnsi="Arial"/>
+                <w:b w:val="false"/>
+                <w:bCs w:val="false"/>
+                <w:color w:val="000000"/>
+                <w:sz w:val="16"/>
+                <w:szCs w:val="16"/>
+              </w:rPr>
+              <w:t xml:space="preserve">0,094 · 0,53</w:t>
+            </w:r>
+          </w:p>
+        </w:tc>
+        <w:tc>
+          <w:tcPr>
+            <w:tcW w:type="dxa" w:w="2300"/>
+            <w:tcBorders>
+              <w:top w:val="single" w:color="BFBFBF" w:sz="4"/>
+              <w:left w:val="single" w:color="BFBFBF" w:sz="4"/>
+              <w:bottom w:val="single" w:color="BFBFBF" w:sz="4"/>
+              <w:right w:val="single" w:color="BFBFBF" w:sz="4"/>
+            </w:tcBorders>
+            <w:tcMar>
+              <w:top w:type="dxa" w:w="40"/>
+              <w:left w:type="dxa" w:w="80"/>
+              <w:bottom w:type="dxa" w:w="40"/>
+              <w:right w:type="dxa" w:w="80"/>
+            </w:tcMar>
+          </w:tcPr>
+          <w:p>
+            <w:pPr>
+              <w:jc w:val="center"/>
+            </w:pPr>
+            <w:r>
+              <w:rPr>
+                <w:rFonts w:ascii="Arial" w:cs="Arial" w:eastAsia="Arial" w:hAnsi="Arial"/>
+                <w:b w:val="false"/>
+                <w:bCs w:val="false"/>
+                <w:color w:val="000000"/>
+                <w:sz w:val="16"/>
+                <w:szCs w:val="16"/>
+              </w:rPr>
+              <w:t xml:space="preserve">0,142 · -0,13</w:t>
+            </w:r>
+          </w:p>
+        </w:tc>
+      </w:tr>
+      <w:tr>
+        <w:tc>
+          <w:tcPr>
+            <w:tcW w:type="dxa" w:w="2300"/>
+            <w:tcBorders>
+              <w:top w:val="single" w:color="BFBFBF" w:sz="4"/>
+              <w:left w:val="single" w:color="BFBFBF" w:sz="4"/>
+              <w:bottom w:val="single" w:color="BFBFBF" w:sz="4"/>
+              <w:right w:val="single" w:color="BFBFBF" w:sz="4"/>
+            </w:tcBorders>
+            <w:tcMar>
+              <w:top w:type="dxa" w:w="40"/>
+              <w:left w:type="dxa" w:w="80"/>
+              <w:bottom w:type="dxa" w:w="40"/>
+              <w:right w:type="dxa" w:w="80"/>
+            </w:tcMar>
+          </w:tcPr>
+          <w:p>
+            <w:pPr>
+              <w:jc w:val="left"/>
+            </w:pPr>
+            <w:r>
+              <w:rPr>
+                <w:rFonts w:ascii="Arial" w:cs="Arial" w:eastAsia="Arial" w:hAnsi="Arial"/>
+                <w:b w:val="false"/>
+                <w:bCs w:val="false"/>
+                <w:color w:val="000000"/>
+                <w:sz w:val="16"/>
+                <w:szCs w:val="16"/>
+              </w:rPr>
+              <w:t xml:space="preserve">Deriva máx. Y (%)</w:t>
+            </w:r>
+          </w:p>
+        </w:tc>
+        <w:tc>
+          <w:tcPr>
+            <w:tcW w:type="dxa" w:w="2300"/>
+            <w:tcBorders>
+              <w:top w:val="single" w:color="BFBFBF" w:sz="4"/>
+              <w:left w:val="single" w:color="BFBFBF" w:sz="4"/>
+              <w:bottom w:val="single" w:color="BFBFBF" w:sz="4"/>
+              <w:right w:val="single" w:color="BFBFBF" w:sz="4"/>
+            </w:tcBorders>
+            <w:tcMar>
+              <w:top w:type="dxa" w:w="40"/>
+              <w:left w:type="dxa" w:w="80"/>
+              <w:bottom w:type="dxa" w:w="40"/>
+              <w:right w:type="dxa" w:w="80"/>
+            </w:tcMar>
+          </w:tcPr>
+          <w:p>
+            <w:pPr>
+              <w:jc w:val="center"/>
+            </w:pPr>
+            <w:r>
+              <w:rPr>
+                <w:rFonts w:ascii="Arial" w:cs="Arial" w:eastAsia="Arial" w:hAnsi="Arial"/>
+                <w:b w:val="false"/>
+                <w:bCs w:val="false"/>
+                <w:color w:val="000000"/>
+                <w:sz w:val="16"/>
+                <w:szCs w:val="16"/>
+              </w:rPr>
+              <w:t xml:space="preserve">0,101 · 0,42</w:t>
+            </w:r>
+          </w:p>
+        </w:tc>
+        <w:tc>
+          <w:tcPr>
+            <w:tcW w:type="dxa" w:w="2300"/>
+            <w:tcBorders>
+              <w:top w:val="single" w:color="BFBFBF" w:sz="4"/>
+              <w:left w:val="single" w:color="BFBFBF" w:sz="4"/>
+              <w:bottom w:val="single" w:color="BFBFBF" w:sz="4"/>
+              <w:right w:val="single" w:color="BFBFBF" w:sz="4"/>
+            </w:tcBorders>
+            <w:tcMar>
+              <w:top w:type="dxa" w:w="40"/>
+              <w:left w:type="dxa" w:w="80"/>
+              <w:bottom w:type="dxa" w:w="40"/>
+              <w:right w:type="dxa" w:w="80"/>
+            </w:tcMar>
+          </w:tcPr>
+          <w:p>
+            <w:pPr>
+              <w:jc w:val="center"/>
+            </w:pPr>
+            <w:r>
+              <w:rPr>
+                <w:rFonts w:ascii="Arial" w:cs="Arial" w:eastAsia="Arial" w:hAnsi="Arial"/>
+                <w:b w:val="false"/>
+                <w:bCs w:val="false"/>
+                <w:color w:val="000000"/>
+                <w:sz w:val="16"/>
+                <w:szCs w:val="16"/>
+              </w:rPr>
+              <w:t xml:space="preserve">0,130 · 0,11</w:t>
+            </w:r>
+          </w:p>
+        </w:tc>
+        <w:tc>
+          <w:tcPr>
+            <w:tcW w:type="dxa" w:w="2300"/>
+            <w:tcBorders>
+              <w:top w:val="single" w:color="BFBFBF" w:sz="4"/>
+              <w:left w:val="single" w:color="BFBFBF" w:sz="4"/>
+              <w:bottom w:val="single" w:color="BFBFBF" w:sz="4"/>
+              <w:right w:val="single" w:color="BFBFBF" w:sz="4"/>
+            </w:tcBorders>
+            <w:tcMar>
+              <w:top w:type="dxa" w:w="40"/>
+              <w:left w:type="dxa" w:w="80"/>
+              <w:bottom w:type="dxa" w:w="40"/>
+              <w:right w:type="dxa" w:w="80"/>
+            </w:tcMar>
+          </w:tcPr>
+          <w:p>
+            <w:pPr>
+              <w:jc w:val="center"/>
+            </w:pPr>
+            <w:r>
+              <w:rPr>
+                <w:rFonts w:ascii="Arial" w:cs="Arial" w:eastAsia="Arial" w:hAnsi="Arial"/>
+                <w:b w:val="false"/>
+                <w:bCs w:val="false"/>
+                <w:color w:val="000000"/>
+                <w:sz w:val="16"/>
+                <w:szCs w:val="16"/>
+              </w:rPr>
+              <w:t xml:space="preserve">0,166 · -0,15</w:t>
+            </w:r>
+          </w:p>
+        </w:tc>
+      </w:tr>
+    </w:tbl>
+    <w:p>
+      <w:pPr>
+        <w:spacing w:after="90"/>
+        <w:jc w:val="center"/>
+      </w:pPr>
+      <w:r>
+        <w:rPr>
+          <w:rFonts w:ascii="Arial" w:cs="Arial" w:eastAsia="Arial" w:hAnsi="Arial"/>
+          <w:i/>
+          <w:iCs/>
+          <w:color w:val="555555"/>
+          <w:sz w:val="16"/>
+          <w:szCs w:val="16"/>
+        </w:rPr>
+        <w:t xml:space="preserve">Tabla 2. Error absoluto medio (MAE) y R² con validación dejando una planta fuera (18 edificios, 9 plantas). Derivas en % de la altura de piso.</w:t>
+      </w:r>
+    </w:p>
+    <w:p>
+      <w:pPr>
+        <w:keepNext/>
+        <w:spacing w:after="30"/>
+        <w:jc w:val="center"/>
+      </w:pPr>
+      <w:r>
+        <w:drawing>
+          <wp:inline distT="0" distB="0" distL="0" distR="0">
+            <wp:extent cx="5334000" cy="2362200"/>
+            <wp:effectExtent t="0" r="0" b="0" l="0"/>
+            <wp:docPr id="4" name=""/>
+            <wp:cNvGraphicFramePr>
+              <a:graphicFrameLocks xmlns:a="http://schemas.openxmlformats.org/drawingml/2006/main" noChangeAspect="1"/>
+            </wp:cNvGraphicFramePr>
+            <a:graphic xmlns:a="http://schemas.openxmlformats.org/drawingml/2006/main">
+              <a:graphicData uri="http://schemas.openxmlformats.org/drawingml/2006/picture">
+                <pic:pic xmlns:pic="http://schemas.openxmlformats.org/drawingml/2006/picture">
+                  <pic:nvPicPr>
+                    <pic:cNvPr id="0" name="" descr=""/>
+                    <pic:cNvPicPr>
+                      <a:picLocks noChangeAspect="1" noChangeArrowheads="1"/>
+                    </pic:cNvPicPr>
+                  </pic:nvPicPr>
+                  <pic:blipFill>
+                    <a:blip r:embed="rId11" cstate="none"/>
+                    <a:srcRect/>
+                    <a:stretch>
+                      <a:fillRect/>
+                    </a:stretch>
+                  </pic:blipFill>
+                  <pic:spPr bwMode="auto">
+                    <a:xfrm>
+                      <a:off x="0" y="0"/>
                       <a:ext cx="5334000" cy="2362200"/>
                     </a:xfrm>
                     <a:prstGeom prst="rect">
@@ -1353,7 +2199,7 @@
           <w:sz w:val="16"/>
           <w:szCs w:val="16"/>
         </w:rPr>
-        <w:t xml:space="preserve">Figura 3. Deriva calculada (OpenSees) frente a predicha por Random Forest en plantas no vistas.</w:t>
+        <w:t xml:space="preserve">Figura 4. Deriva calculada (OpenSees, profesor) frente a predicha por Random Forest en plantas NSR-10 no vistas.</w:t>
       </w:r>
     </w:p>
     <w:p>
@@ -1367,12 +2213,13 @@
           <w:sz w:val="19"/>
           <w:szCs w:val="19"/>
         </w:rPr>
-        <w:t xml:space="preserve">De los 7 edificios con deriva ≥ 0,90 %, el modelo identificó 3 y no generó falsas alarmas; los 4 restantes fueron subestimados (Figura 3). La predicción de un edificio tomó 32 ms y el entrenamiento de cada modelo unos 0,4 s.</w:t>
+        <w:t xml:space="preserve">De los 7 edificios con deriva ≥ 0,90 %, el modelo identificó 3 y no generó falsas alarmas; los 4 restantes fueron subestimados (Figura 4). La predicción de un edificio tomó 32 ms y el entrenamiento de cada modelo unos 0,4 s.</w:t>
       </w:r>
     </w:p>
     <w:p>
       <w:pPr>
         <w:pStyle w:val="Heading1"/>
+        <w:keepNext/>
         <w:spacing w:after="60" w:before="140"/>
       </w:pPr>
       <w:r>
@@ -1398,7 +2245,7 @@
           <w:sz w:val="19"/>
           <w:szCs w:val="19"/>
         </w:rPr>
-        <w:t xml:space="preserve">Los resultados responden parcialmente la pregunta. En la ruta NSR-10, Random Forest aproxima la deriva de configuraciones no vistas con un error del orden de una décima de punto porcentual, suficiente para ordenar alternativas, pero todavía no para afirmar si un edificio cercano al límite cumple: la tendencia a subestimar los casos más exigentes obliga a mantener la verificación con el módulo NSR-10 y SAP2000. Tres factores explican esta limitación: el tamaño de la muestra (18 casos), el carácter teórico de varios diseños del profesor y el hecho de que las derivas de diseño convergen cerca del límite, lo que reduce su variabilidad.</w:t>
+        <w:t xml:space="preserve">Los resultados responden la pregunta en dos escalas. Con una base amplia y trazable (E.030), Random Forest estima la deriva de familias no vistas con un error de unas cuatro centésimas de punto porcentual y detecta el 94 % de las excedencias, precisión suficiente para descartar alternativas antes de modelarlas; los casos no detectados están a menos de 0,06 puntos del límite, por lo que la verificación final sigue siendo necesaria en esa franja. Con 18 edificios teóricos (NSR-10), el mismo método solo ordena alternativas: el error es de una décima de punto y la mayoría de los casos exigentes se subestiman. La diferencia se explica por el tamaño de la muestra, el carácter teórico de varios diseños del profesor y las variables físicas usadas en la ruta E.030. Que Gradient Boosting mejore poco a Random Forest indica que la elección del algoritmo es secundaria frente a la calidad y cantidad de los datos.</w:t>
       </w:r>
     </w:p>
     <w:p>
@@ -1412,7 +2259,7 @@
           <w:sz w:val="19"/>
           <w:szCs w:val="19"/>
         </w:rPr>
-        <w:t xml:space="preserve">El módulo NSR-10 aporta lo que el predictor no puede dar por sí solo: respuestas de referencia trazables, validación de entradas y registros listos para ampliar la base. La evaluación del Random Forest sobre las familias reservadas de la base E.030, más numerosa, es la siguiente evidencia necesaria para generalizar; sus resultados no se mezclan con los de la ruta colombiana porque responden a otra norma, otro rango de alturas y otra hipótesis de rigidez. El ahorro de tiempo se manifiesta en la predicción (milisegundos por alternativa), pero no se cronometró el procedimiento completo de modelación en SAP2000, por lo que no se reporta un porcentaje de ahorro.</w:t>
+        <w:t xml:space="preserve">El módulo NSR-10 aporta lo que el predictor no puede dar por sí solo: respuestas de referencia trazables, validación de entradas y registros para ampliar la base colombiana hacia un tamaño comparable al de la E.030. Las dos rutas no se mezclan porque responden a normas, unidades, rangos de altura e hipótesis distintas; el modelo E.030 solo es válido dentro de su dominio (dos a cinco pisos) y rechaza entradas fuera de él. El ahorro de tiempo se manifiesta en la predicción (fracciones de segundo por alternativa frente a un análisis completo), pero no se cronometró el procedimiento manual de modelación en SAP2000, por lo que no se reporta un porcentaje de ahorro.</w:t>
       </w:r>
     </w:p>
     <w:p>
@@ -1432,6 +2279,7 @@
     <w:p>
       <w:pPr>
         <w:pStyle w:val="Heading1"/>
+        <w:keepNext/>
         <w:spacing w:after="60" w:before="140"/>
       </w:pPr>
       <w:r>
@@ -1479,7 +2327,7 @@
           <w:sz w:val="19"/>
           <w:szCs w:val="19"/>
         </w:rPr>
-        <w:t xml:space="preserve">Con validación por planta, Random Forest estimó la deriva máxima con MAE de 0,086 % y 0,101 %, un 39 % menos que la referencia, y mejoró la fórmula Ta en la estimación del periodo.</w:t>
+        <w:t xml:space="preserve">En 300 familias E.030 no vistas, Random Forest estimó la deriva máxima con MAE de 0,040 % y R² de 0,99, y detectó 137 de 146 excedencias; Gradient Boosting, como comparación, llegó a R² de 0,995.</w:t>
       </w:r>
     </w:p>
     <w:p>
@@ -1497,7 +2345,7 @@
           <w:sz w:val="19"/>
           <w:szCs w:val="19"/>
         </w:rPr>
-        <w:t xml:space="preserve">Con 18 casos teóricos el modelo detecta 3 de 7 edificios cercanos al límite: sirve para priorizar alternativas, no para certificar cumplimiento.</w:t>
+        <w:t xml:space="preserve">Con 18 casos NSR-10 teóricos y validación por planta, Random Forest redujo el error de deriva un 39 % frente a la referencia (MAE de 0,086 % y 0,101 %), pero detectó 3 de 7 edificios cercanos al límite: sirve para priorizar, no para certificar.</w:t>
       </w:r>
     </w:p>
     <w:p>
@@ -1515,12 +2363,13 @@
           <w:sz w:val="19"/>
           <w:szCs w:val="19"/>
         </w:rPr>
-        <w:t xml:space="preserve">Los siguientes pasos son evaluar el modelo en las familias reservadas E.030, ampliar la base NSR-10 con casos verificados y conectar el módulo y el predictor al bot de Telegram como interfaz.</w:t>
+        <w:t xml:space="preserve">La precisión depende más de la cantidad y trazabilidad de los datos que del algoritmo. Siguientes pasos: ampliar la base NSR-10 con casos verificados por el módulo, conectar módulo y predictor al bot de Telegram y cronometrar el flujo completo para cuantificar el ahorro.</w:t>
       </w:r>
     </w:p>
     <w:p>
       <w:pPr>
         <w:pStyle w:val="Heading1"/>
+        <w:keepNext/>
         <w:spacing w:after="60" w:before="140"/>
       </w:pPr>
       <w:r>
@@ -1558,7 +2407,7 @@
           <w:sz w:val="16"/>
           <w:szCs w:val="16"/>
         </w:rPr>
-        <w:t xml:space="preserve">[2] Ministerio de Vivienda, Construcción y Saneamiento. (2018). Norma Técnica E.030 Diseño Sismorresistente. Lima.</w:t>
+        <w:t xml:space="preserve">[2] Ministerio de Vivienda, Construcción y Saneamiento. (2026). Norma Técnica E.030 Diseño Sismorresistente (RM 183-2026-VIVIENDA). Lima.</w:t>
       </w:r>
     </w:p>
     <w:p>
@@ -1652,8 +2501,34 @@
         <w:t xml:space="preserve">[9] Pedregosa, F., et al. (2011). Scikit-learn: Machine learning in Python. Journal of Machine Learning Research, 12, 2825–2830.</w:t>
       </w:r>
     </w:p>
+    <w:p>
+      <w:pPr>
+        <w:spacing w:after="30"/>
+      </w:pPr>
+      <w:r>
+        <w:rPr>
+          <w:rFonts w:ascii="Arial" w:cs="Arial" w:eastAsia="Arial" w:hAnsi="Arial"/>
+          <w:sz w:val="16"/>
+          <w:szCs w:val="16"/>
+        </w:rPr>
+        <w:t xml:space="preserve">[10] Friedman, J. H. (2001). Greedy function approximation: A gradient boosting machine. The Annals of Statistics, 29(5), 1189–1232.</w:t>
+      </w:r>
+    </w:p>
+    <w:p>
+      <w:pPr>
+        <w:spacing w:after="30"/>
+      </w:pPr>
+      <w:r>
+        <w:rPr>
+          <w:rFonts w:ascii="Arial" w:cs="Arial" w:eastAsia="Arial" w:hAnsi="Arial"/>
+          <w:sz w:val="16"/>
+          <w:szCs w:val="16"/>
+        </w:rPr>
+        <w:t xml:space="preserve">[11] Equipo Nexo Sísmico. (2026). Pórticos de concreto armado: generador, análisis E.030 y modelos de aprendizaje [Repositorio de código]. https://github.com/PieroVQ/ProyectoGH</w:t>
+      </w:r>
+    </w:p>
     <w:sectPr>
-      <w:footerReference w:type="default" r:id="rId7"/>
+      <w:footerReference w:type="default" r:id="rId6"/>
       <w:pgSz w:w="12240" w:h="15840" w:orient="portrait"/>
       <w:pgMar w:top="900" w:right="1000" w:bottom="900" w:left="1000" w:header="708" w:footer="708" w:gutter="0"/>
       <w:pgNumType/>
@@ -1661,10 +2536,6 @@
     </w:sectPr>
   </w:body>
 </w:document>
-</file>
-
-<file path=word/comments.xml><?xml version="1.0" encoding="utf-8"?>
-<w:comments xmlns:cx="http://schemas.microsoft.com/office/drawing/2014/chartex" xmlns:cx1="http://schemas.microsoft.com/office/drawing/2015/9/8/chartex" xmlns:cx2="http://schemas.microsoft.com/office/drawing/2015/10/21/chartex" xmlns:cx3="http://schemas.microsoft.com/office/drawing/2016/5/9/chartex" xmlns:cx4="http://schemas.microsoft.com/office/drawing/2016/5/10/chartex" xmlns:cx5="http://schemas.microsoft.com/office/drawing/2016/5/11/chartex" xmlns:cx6="http://schemas.microsoft.com/office/drawing/2016/5/12/chartex" xmlns:cx7="http://schemas.microsoft.com/office/drawing/2016/5/13/chartex" xmlns:cx8="http://schemas.microsoft.com/office/drawing/2016/5/14/chartex" xmlns:mc="http://schemas.openxmlformats.org/markup-compatibility/2006" xmlns:aink="http://schemas.microsoft.com/office/drawing/2016/ink" xmlns:am3d="http://schemas.microsoft.com/office/drawing/2017/model3d" xmlns:o="urn:schemas-microsoft-com:office:office" xmlns:r="http://schemas.openxmlformats.org/officeDocument/2006/relationships" xmlns:m="http://schemas.openxmlformats.org/officeDocument/2006/math" xmlns:v="urn:schemas-microsoft-com:vml" xmlns:wp14="http://schemas.microsoft.com/office/word/2010/wordprocessingDrawing" xmlns:wp="http://schemas.openxmlformats.org/drawingml/2006/wordprocessingDrawing" xmlns:w10="urn:schemas-microsoft-com:office:word" xmlns:w="http://schemas.openxmlformats.org/wordprocessingml/2006/main" xmlns:w14="http://schemas.microsoft.com/office/word/2010/wordml" xmlns:w15="http://schemas.microsoft.com/office/word/2012/wordml" xmlns:w16cex="http://schemas.microsoft.com/office/word/2018/wordml/cex" xmlns:w16cid="http://schemas.microsoft.com/office/word/2016/wordml/cid" xmlns:w16="http://schemas.microsoft.com/office/word/2018/wordml" xmlns:w16sdtdh="http://schemas.microsoft.com/office/word/2020/wordml/sdtdatahash" xmlns:w16se="http://schemas.microsoft.com/office/word/2015/wordml/symex" xmlns:wpg="http://schemas.microsoft.com/office/word/2010/wordprocessingGroup" xmlns:wpi="http://schemas.microsoft.com/office/word/2010/wordprocessingInk" xmlns:wne="http://schemas.microsoft.com/office/word/2006/wordml" xmlns:wps="http://schemas.microsoft.com/office/word/2010/wordprocessingShape"/>
 </file>
 
 <file path=word/endnotes.xml><?xml version="1.0" encoding="utf-8"?>
@@ -1727,8 +2598,32 @@
         <w:szCs w:val="14"/>
       </w:rPr>
       <w:fldChar w:fldCharType="begin"/>
+    </w:r>
+    <w:r>
+      <w:rPr>
+        <w:rFonts w:ascii="Arial" w:cs="Arial" w:eastAsia="Arial" w:hAnsi="Arial"/>
+        <w:color w:val="777777"/>
+        <w:sz w:val="14"/>
+        <w:szCs w:val="14"/>
+      </w:rPr>
       <w:instrText xml:space="preserve">PAGE</w:instrText>
+    </w:r>
+    <w:r>
+      <w:rPr>
+        <w:rFonts w:ascii="Arial" w:cs="Arial" w:eastAsia="Arial" w:hAnsi="Arial"/>
+        <w:color w:val="777777"/>
+        <w:sz w:val="14"/>
+        <w:szCs w:val="14"/>
+      </w:rPr>
       <w:fldChar w:fldCharType="separate"/>
+    </w:r>
+    <w:r>
+      <w:rPr>
+        <w:rFonts w:ascii="Arial" w:cs="Arial" w:eastAsia="Arial" w:hAnsi="Arial"/>
+        <w:color w:val="777777"/>
+        <w:sz w:val="14"/>
+        <w:szCs w:val="14"/>
+      </w:rPr>
       <w:fldChar w:fldCharType="end"/>
     </w:r>
   </w:p>
@@ -1776,7 +2671,7 @@
 <w:numbering xmlns:wpc="http://schemas.microsoft.com/office/word/2010/wordprocessingCanvas" xmlns:mc="http://schemas.openxmlformats.org/markup-compatibility/2006" xmlns:o="urn:schemas-microsoft-com:office:office" xmlns:r="http://schemas.openxmlformats.org/officeDocument/2006/relationships" xmlns:m="http://schemas.openxmlformats.org/officeDocument/2006/math" xmlns:v="urn:schemas-microsoft-com:vml" xmlns:wp14="http://schemas.microsoft.com/office/word/2010/wordprocessingDrawing" xmlns:wp="http://schemas.openxmlformats.org/drawingml/2006/wordprocessingDrawing" xmlns:w10="urn:schemas-microsoft-com:office:word" xmlns:w="http://schemas.openxmlformats.org/wordprocessingml/2006/main" xmlns:w14="http://schemas.microsoft.com/office/word/2010/wordml" xmlns:w15="http://schemas.microsoft.com/office/word/2012/wordml" xmlns:wpg="http://schemas.microsoft.com/office/word/2010/wordprocessingGroup" xmlns:wpi="http://schemas.microsoft.com/office/word/2010/wordprocessingInk" xmlns:wne="http://schemas.microsoft.com/office/word/2006/wordml" xmlns:wps="http://schemas.microsoft.com/office/word/2010/wordprocessingShape" mc:Ignorable="w14 w15 wp14">
   <w:abstractNum w:abstractNumId="1" w15:restartNumberingAfterBreak="0">
     <w:multiLevelType w:val="hybridMultilevel"/>
-    <w:lvl w:ilvl="0" w15:tentative="1">
+    <w:lvl w:ilvl="0" w:tentative="1">
       <w:start w:val="1"/>
       <w:numFmt w:val="bullet"/>
       <w:lvlText w:val="●"/>
@@ -1785,7 +2680,7 @@
         <w:ind w:left="720" w:hanging="360"/>
       </w:pPr>
     </w:lvl>
-    <w:lvl w:ilvl="1" w15:tentative="1">
+    <w:lvl w:ilvl="1" w:tentative="1">
       <w:start w:val="1"/>
       <w:numFmt w:val="bullet"/>
       <w:lvlText w:val="○"/>
@@ -1794,7 +2689,7 @@
         <w:ind w:left="1440" w:hanging="360"/>
       </w:pPr>
     </w:lvl>
-    <w:lvl w:ilvl="2" w15:tentative="1">
+    <w:lvl w:ilvl="2" w:tentative="1">
       <w:start w:val="1"/>
       <w:numFmt w:val="bullet"/>
       <w:lvlText w:val="■"/>
@@ -1803,7 +2698,7 @@
         <w:ind w:left="2160" w:hanging="360"/>
       </w:pPr>
     </w:lvl>
-    <w:lvl w:ilvl="3" w15:tentative="1">
+    <w:lvl w:ilvl="3" w:tentative="1">
       <w:start w:val="1"/>
       <w:numFmt w:val="bullet"/>
       <w:lvlText w:val="●"/>
@@ -1812,7 +2707,7 @@
         <w:ind w:left="2880" w:hanging="360"/>
       </w:pPr>
     </w:lvl>
-    <w:lvl w:ilvl="4" w15:tentative="1">
+    <w:lvl w:ilvl="4" w:tentative="1">
       <w:start w:val="1"/>
       <w:numFmt w:val="bullet"/>
       <w:lvlText w:val="○"/>
@@ -1821,7 +2716,7 @@
         <w:ind w:left="3600" w:hanging="360"/>
       </w:pPr>
     </w:lvl>
-    <w:lvl w:ilvl="5" w15:tentative="1">
+    <w:lvl w:ilvl="5" w:tentative="1">
       <w:start w:val="1"/>
       <w:numFmt w:val="bullet"/>
       <w:lvlText w:val="■"/>
@@ -1830,7 +2725,7 @@
         <w:ind w:left="4320" w:hanging="360"/>
       </w:pPr>
     </w:lvl>
-    <w:lvl w:ilvl="6" w15:tentative="1">
+    <w:lvl w:ilvl="6" w:tentative="1">
       <w:start w:val="1"/>
       <w:numFmt w:val="bullet"/>
       <w:lvlText w:val="●"/>
@@ -1839,7 +2734,7 @@
         <w:ind w:left="5040" w:hanging="360"/>
       </w:pPr>
     </w:lvl>
-    <w:lvl w:ilvl="7" w15:tentative="1">
+    <w:lvl w:ilvl="7" w:tentative="1">
       <w:start w:val="1"/>
       <w:numFmt w:val="bullet"/>
       <w:lvlText w:val="●"/>
@@ -1848,7 +2743,7 @@
         <w:ind w:left="5760" w:hanging="360"/>
       </w:pPr>
     </w:lvl>
-    <w:lvl w:ilvl="8" w15:tentative="1">
+    <w:lvl w:ilvl="8" w:tentative="1">
       <w:start w:val="1"/>
       <w:numFmt w:val="bullet"/>
       <w:lvlText w:val="●"/>
@@ -1860,7 +2755,7 @@
   </w:abstractNum>
   <w:abstractNum w:abstractNumId="2" w15:restartNumberingAfterBreak="0">
     <w:multiLevelType w:val="hybridMultilevel"/>
-    <w:lvl w:ilvl="0" w15:tentative="1">
+    <w:lvl w:ilvl="0" w:tentative="1">
       <w:start w:val="1"/>
       <w:numFmt w:val="bullet"/>
       <w:lvlText w:val="•"/>
@@ -1891,6 +2786,25 @@
     <w:rPrDefault/>
     <w:pPrDefault/>
   </w:docDefaults>
+  <w:style w:type="paragraph" w:styleId="Normal" w:default="1">
+    <w:name w:val="Normal"/>
+    <w:qFormat/>
+  </w:style>
+  <w:style w:type="table" w:styleId="TableNormal" w:default="true">
+    <w:name w:val="Normal Table"/>
+    <w:uiPriority w:val="99"/>
+    <w:semiHidden/>
+    <w:unhideWhenUsed/>
+    <w:tblPr>
+      <w:tblInd w:type="dxa" w:w="0"/>
+      <w:tblCellMar>
+        <w:top w:type="dxa" w:w="0"/>
+        <w:left w:type="dxa" w:w="108"/>
+        <w:bottom w:type="dxa" w:w="0"/>
+        <w:right w:type="dxa" w:w="108"/>
+      </w:tblCellMar>
+    </w:tblPr>
+  </w:style>
   <w:style w:type="paragraph" w:styleId="Title">
     <w:name w:val="Title"/>
     <w:basedOn w:val="Normal"/>
@@ -1978,6 +2892,139 @@
     <w:basedOn w:val="Normal"/>
     <w:qFormat/>
   </w:style>
+  <w:style w:type="paragraph" w:styleId="Caption">
+    <w:name w:val="caption"/>
+    <w:basedOn w:val="Normal"/>
+    <w:next w:val="Normal"/>
+    <w:uiPriority w:val="35"/>
+    <w:semiHidden/>
+    <w:unhideWhenUsed/>
+    <w:qFormat/>
+    <w:pPr>
+      <w:spacing w:after="200"/>
+    </w:pPr>
+    <w:rPr>
+      <w:i/>
+      <w:iCs/>
+      <w:color w:val="44546A" w:themeColor="dark2"/>
+      <w:sz w:val="18"/>
+      <w:szCs w:val="18"/>
+    </w:rPr>
+  </w:style>
+  <w:style w:type="paragraph" w:styleId="Bibliography">
+    <w:name w:val="Bibliography"/>
+    <w:basedOn w:val="Normal"/>
+    <w:next w:val="Normal"/>
+    <w:uiPriority w:val="37"/>
+    <w:unhideWhenUsed/>
+  </w:style>
+  <w:style w:type="paragraph" w:styleId="TOC1">
+    <w:name w:val="toc 1"/>
+    <w:basedOn w:val="Normal"/>
+    <w:next w:val="Normal"/>
+    <w:uiPriority w:val="39"/>
+    <w:semiHidden/>
+    <w:unhideWhenUsed/>
+    <w:pPr>
+      <w:spacing w:after="100"/>
+    </w:pPr>
+  </w:style>
+  <w:style w:type="paragraph" w:styleId="TOC2">
+    <w:name w:val="toc 2"/>
+    <w:basedOn w:val="Normal"/>
+    <w:next w:val="Normal"/>
+    <w:uiPriority w:val="39"/>
+    <w:semiHidden/>
+    <w:unhideWhenUsed/>
+    <w:pPr>
+      <w:spacing w:after="100"/>
+      <w:ind w:left="200"/>
+    </w:pPr>
+  </w:style>
+  <w:style w:type="paragraph" w:styleId="TOC3">
+    <w:name w:val="toc 3"/>
+    <w:basedOn w:val="Normal"/>
+    <w:next w:val="Normal"/>
+    <w:uiPriority w:val="39"/>
+    <w:semiHidden/>
+    <w:unhideWhenUsed/>
+    <w:pPr>
+      <w:spacing w:after="100"/>
+      <w:ind w:left="400"/>
+    </w:pPr>
+  </w:style>
+  <w:style w:type="paragraph" w:styleId="TOC4">
+    <w:name w:val="toc 4"/>
+    <w:basedOn w:val="Normal"/>
+    <w:next w:val="Normal"/>
+    <w:uiPriority w:val="39"/>
+    <w:semiHidden/>
+    <w:unhideWhenUsed/>
+    <w:pPr>
+      <w:spacing w:after="100"/>
+      <w:ind w:left="600"/>
+    </w:pPr>
+  </w:style>
+  <w:style w:type="paragraph" w:styleId="TOC5">
+    <w:name w:val="toc 5"/>
+    <w:basedOn w:val="Normal"/>
+    <w:next w:val="Normal"/>
+    <w:uiPriority w:val="39"/>
+    <w:semiHidden/>
+    <w:unhideWhenUsed/>
+    <w:pPr>
+      <w:spacing w:after="100"/>
+      <w:ind w:left="800"/>
+    </w:pPr>
+  </w:style>
+  <w:style w:type="paragraph" w:styleId="TOC6">
+    <w:name w:val="toc 6"/>
+    <w:basedOn w:val="Normal"/>
+    <w:next w:val="Normal"/>
+    <w:uiPriority w:val="39"/>
+    <w:semiHidden/>
+    <w:unhideWhenUsed/>
+    <w:pPr>
+      <w:spacing w:after="100"/>
+      <w:ind w:left="1000"/>
+    </w:pPr>
+  </w:style>
+  <w:style w:type="paragraph" w:styleId="TOC7">
+    <w:name w:val="toc 7"/>
+    <w:basedOn w:val="Normal"/>
+    <w:next w:val="Normal"/>
+    <w:uiPriority w:val="39"/>
+    <w:semiHidden/>
+    <w:unhideWhenUsed/>
+    <w:pPr>
+      <w:spacing w:after="100"/>
+      <w:ind w:left="1200"/>
+    </w:pPr>
+  </w:style>
+  <w:style w:type="paragraph" w:styleId="TOC8">
+    <w:name w:val="toc 8"/>
+    <w:basedOn w:val="Normal"/>
+    <w:next w:val="Normal"/>
+    <w:uiPriority w:val="39"/>
+    <w:semiHidden/>
+    <w:unhideWhenUsed/>
+    <w:pPr>
+      <w:spacing w:after="100"/>
+      <w:ind w:left="1400"/>
+    </w:pPr>
+  </w:style>
+  <w:style w:type="paragraph" w:styleId="TOC9">
+    <w:name w:val="toc 9"/>
+    <w:basedOn w:val="Normal"/>
+    <w:next w:val="Normal"/>
+    <w:uiPriority w:val="39"/>
+    <w:semiHidden/>
+    <w:unhideWhenUsed/>
+    <w:pPr>
+      <w:spacing w:after="100"/>
+      <w:ind w:left="1600"/>
+    </w:pPr>
+  </w:style>
   <w:style w:type="character" w:styleId="Hyperlink">
     <w:name w:val="Hyperlink"/>
     <w:basedOn w:val="DefaultParagraphFont"/>
@@ -2062,5 +3109,302 @@
       <w:szCs w:val="20"/>
     </w:rPr>
   </w:style>
+  <w:style w:type="character" w:styleId="LineNumber">
+    <w:name w:val="line number"/>
+    <w:basedOn w:val="DefaultParagraphFont"/>
+    <w:uiPriority w:val="99"/>
+    <w:semiHidden/>
+    <w:unhideWhenUsed/>
+  </w:style>
 </w:styles>
+</file>
+
+<file path=word/theme/theme1.xml><?xml version="1.0" encoding="utf-8"?>
+<a:theme xmlns:a="http://schemas.openxmlformats.org/drawingml/2006/main" name="Office Theme">
+  <a:themeElements>
+    <a:clrScheme name="Office">
+      <a:dk1>
+        <a:sysClr val="windowText" lastClr="000000"/>
+      </a:dk1>
+      <a:lt1>
+        <a:sysClr val="window" lastClr="FFFFFF"/>
+      </a:lt1>
+      <a:dk2>
+        <a:srgbClr val="44546A"/>
+      </a:dk2>
+      <a:lt2>
+        <a:srgbClr val="E7E6E6"/>
+      </a:lt2>
+      <a:accent1>
+        <a:srgbClr val="4472C4"/>
+      </a:accent1>
+      <a:accent2>
+        <a:srgbClr val="ED7D31"/>
+      </a:accent2>
+      <a:accent3>
+        <a:srgbClr val="A5A5A5"/>
+      </a:accent3>
+      <a:accent4>
+        <a:srgbClr val="FFC000"/>
+      </a:accent4>
+      <a:accent5>
+        <a:srgbClr val="5B9BD5"/>
+      </a:accent5>
+      <a:accent6>
+        <a:srgbClr val="70AD47"/>
+      </a:accent6>
+      <a:hlink>
+        <a:srgbClr val="0563C1"/>
+      </a:hlink>
+      <a:folHlink>
+        <a:srgbClr val="954F72"/>
+      </a:folHlink>
+    </a:clrScheme>
+    <a:fontScheme name="Office">
+      <a:majorFont>
+        <a:latin typeface="Calibri Light" panose="020F0302020204030204"/>
+        <a:ea typeface=""/>
+        <a:cs typeface=""/>
+        <a:font script="Jpan" typeface="游ゴシック Light"/>
+        <a:font script="Hang" typeface="맑은 고딕"/>
+        <a:font script="Hans" typeface="等线 Light"/>
+        <a:font script="Hant" typeface="新細明體"/>
+        <a:font script="Arab" typeface="Times New Roman"/>
+        <a:font script="Hebr" typeface="Times New Roman"/>
+        <a:font script="Thai" typeface="Angsana New"/>
+        <a:font script="Ethi" typeface="Nyala"/>
+        <a:font script="Beng" typeface="Vrinda"/>
+        <a:font script="Gujr" typeface="Shruti"/>
+        <a:font script="Khmr" typeface="MoolBoran"/>
+        <a:font script="Knda" typeface="Tunga"/>
+        <a:font script="Guru" typeface="Raavi"/>
+        <a:font script="Cans" typeface="Euphemia"/>
+        <a:font script="Cher" typeface="Plantagenet Cherokee"/>
+        <a:font script="Yiii" typeface="Microsoft Yi Baiti"/>
+        <a:font script="Tibt" typeface="Microsoft Himalaya"/>
+        <a:font script="Thaa" typeface="MV Boli"/>
+        <a:font script="Deva" typeface="Mangal"/>
+        <a:font script="Telu" typeface="Gautami"/>
+        <a:font script="Taml" typeface="Latha"/>
+        <a:font script="Syrc" typeface="Estrangelo Edessa"/>
+        <a:font script="Orya" typeface="Kalinga"/>
+        <a:font script="Mlym" typeface="Kartika"/>
+        <a:font script="Laoo" typeface="DokChampa"/>
+        <a:font script="Sinh" typeface="Iskoola Pota"/>
+        <a:font script="Mong" typeface="Mongolian Baiti"/>
+        <a:font script="Viet" typeface="Times New Roman"/>
+        <a:font script="Uigh" typeface="Microsoft Uighur"/>
+        <a:font script="Geor" typeface="Sylfaen"/>
+        <a:font script="Armn" typeface="Arial"/>
+        <a:font script="Bugi" typeface="Leelawadee UI"/>
+        <a:font script="Bopo" typeface="Microsoft JhengHei"/>
+        <a:font script="Java" typeface="Javanese Text"/>
+        <a:font script="Lisu" typeface="Segoe UI"/>
+        <a:font script="Mymr" typeface="Myanmar Text"/>
+        <a:font script="Nkoo" typeface="Ebrima"/>
+        <a:font script="Olck" typeface="Nirmala UI"/>
+        <a:font script="Osma" typeface="Ebrima"/>
+        <a:font script="Phag" typeface="Phagspa"/>
+        <a:font script="Syrn" typeface="Estrangelo Edessa"/>
+        <a:font script="Syrj" typeface="Estrangelo Edessa"/>
+        <a:font script="Syre" typeface="Estrangelo Edessa"/>
+        <a:font script="Sora" typeface="Nirmala UI"/>
+        <a:font script="Tale" typeface="Microsoft Tai Le"/>
+        <a:font script="Talu" typeface="Microsoft New Tai Lue"/>
+        <a:font script="Tfng" typeface="Ebrima"/>
+      </a:majorFont>
+      <a:minorFont>
+        <a:latin typeface="Calibri" panose="020F0502020204030204"/>
+        <a:ea typeface=""/>
+        <a:cs typeface=""/>
+        <a:font script="Jpan" typeface="游明朝"/>
+        <a:font script="Hang" typeface="맑은 고딕"/>
+        <a:font script="Hans" typeface="等线"/>
+        <a:font script="Hant" typeface="新細明體"/>
+        <a:font script="Arab" typeface="Arial"/>
+        <a:font script="Hebr" typeface="Arial"/>
+        <a:font script="Thai" typeface="Cordia New"/>
+        <a:font script="Ethi" typeface="Nyala"/>
+        <a:font script="Beng" typeface="Vrinda"/>
+        <a:font script="Gujr" typeface="Shruti"/>
+        <a:font script="Khmr" typeface="DaunPenh"/>
+        <a:font script="Knda" typeface="Tunga"/>
+        <a:font script="Guru" typeface="Raavi"/>
+        <a:font script="Cans" typeface="Euphemia"/>
+        <a:font script="Cher" typeface="Plantagenet Cherokee"/>
+        <a:font script="Yiii" typeface="Microsoft Yi Baiti"/>
+        <a:font script="Tibt" typeface="Microsoft Himalaya"/>
+        <a:font script="Thaa" typeface="MV Boli"/>
+        <a:font script="Deva" typeface="Mangal"/>
+        <a:font script="Telu" typeface="Gautami"/>
+        <a:font script="Taml" typeface="Latha"/>
+        <a:font script="Syrc" typeface="Estrangelo Edessa"/>
+        <a:font script="Orya" typeface="Kalinga"/>
+        <a:font script="Mlym" typeface="Kartika"/>
+        <a:font script="Laoo" typeface="DokChampa"/>
+        <a:font script="Sinh" typeface="Iskoola Pota"/>
+        <a:font script="Mong" typeface="Mongolian Baiti"/>
+        <a:font script="Viet" typeface="Arial"/>
+        <a:font script="Uigh" typeface="Microsoft Uighur"/>
+        <a:font script="Geor" typeface="Sylfaen"/>
+        <a:font script="Armn" typeface="Arial"/>
+        <a:font script="Bugi" typeface="Leelawadee UI"/>
+        <a:font script="Bopo" typeface="Microsoft JhengHei"/>
+        <a:font script="Java" typeface="Javanese Text"/>
+        <a:font script="Lisu" typeface="Segoe UI"/>
+        <a:font script="Mymr" typeface="Myanmar Text"/>
+        <a:font script="Nkoo" typeface="Ebrima"/>
+        <a:font script="Olck" typeface="Nirmala UI"/>
+        <a:font script="Osma" typeface="Ebrima"/>
+        <a:font script="Phag" typeface="Phagspa"/>
+        <a:font script="Syrn" typeface="Estrangelo Edessa"/>
+        <a:font script="Syrj" typeface="Estrangelo Edessa"/>
+        <a:font script="Syre" typeface="Estrangelo Edessa"/>
+        <a:font script="Sora" typeface="Nirmala UI"/>
+        <a:font script="Tale" typeface="Microsoft Tai Le"/>
+        <a:font script="Talu" typeface="Microsoft New Tai Lue"/>
+        <a:font script="Tfng" typeface="Ebrima"/>
+      </a:minorFont>
+    </a:fontScheme>
+    <a:fmtScheme name="Office">
+      <a:fillStyleLst>
+        <a:solidFill>
+          <a:schemeClr val="phClr"/>
+        </a:solidFill>
+        <a:gradFill rotWithShape="true">
+          <a:gsLst>
+            <a:gs pos="0">
+              <a:schemeClr val="phClr">
+                <a:lumMod val="110000"/>
+                <a:satMod val="105000"/>
+                <a:tint val="67000"/>
+              </a:schemeClr>
+            </a:gs>
+            <a:gs pos="50000">
+              <a:schemeClr val="phClr">
+                <a:lumMod val="105000"/>
+                <a:satMod val="103000"/>
+                <a:tint val="73000"/>
+              </a:schemeClr>
+            </a:gs>
+            <a:gs pos="100000">
+              <a:schemeClr val="phClr">
+                <a:lumMod val="105000"/>
+                <a:satMod val="109000"/>
+                <a:tint val="81000"/>
+              </a:schemeClr>
+            </a:gs>
+          </a:gsLst>
+          <a:lin ang="5400000" scaled="false"/>
+        </a:gradFill>
+        <a:gradFill rotWithShape="true">
+          <a:gsLst>
+            <a:gs pos="0">
+              <a:schemeClr val="phClr">
+                <a:satMod val="103000"/>
+                <a:lumMod val="102000"/>
+                <a:tint val="94000"/>
+              </a:schemeClr>
+            </a:gs>
+            <a:gs pos="50000">
+              <a:schemeClr val="phClr">
+                <a:satMod val="110000"/>
+                <a:lumMod val="100000"/>
+                <a:shade val="100000"/>
+              </a:schemeClr>
+            </a:gs>
+            <a:gs pos="100000">
+              <a:schemeClr val="phClr">
+                <a:lumMod val="99000"/>
+                <a:satMod val="120000"/>
+                <a:shade val="78000"/>
+              </a:schemeClr>
+            </a:gs>
+          </a:gsLst>
+          <a:lin ang="5400000" scaled="false"/>
+        </a:gradFill>
+      </a:fillStyleLst>
+      <a:lnStyleLst>
+        <a:ln w="6350" cap="flat" cmpd="sng" algn="ctr">
+          <a:solidFill>
+            <a:schemeClr val="phClr"/>
+          </a:solidFill>
+          <a:prstDash val="solid"/>
+          <a:miter lim="800000"/>
+        </a:ln>
+        <a:ln w="12700" cap="flat" cmpd="sng" algn="ctr">
+          <a:solidFill>
+            <a:schemeClr val="phClr"/>
+          </a:solidFill>
+          <a:prstDash val="solid"/>
+          <a:miter lim="800000"/>
+        </a:ln>
+        <a:ln w="19050" cap="flat" cmpd="sng" algn="ctr">
+          <a:solidFill>
+            <a:schemeClr val="phClr"/>
+          </a:solidFill>
+          <a:prstDash val="solid"/>
+          <a:miter lim="800000"/>
+        </a:ln>
+      </a:lnStyleLst>
+      <a:effectStyleLst>
+        <a:effectStyle>
+          <a:effectLst/>
+        </a:effectStyle>
+        <a:effectStyle>
+          <a:effectLst/>
+        </a:effectStyle>
+        <a:effectStyle>
+          <a:effectLst>
+            <a:outerShdw blurRad="57150" dist="19050" dir="5400000" algn="ctr" rotWithShape="false">
+              <a:srgbClr val="000000">
+                <a:alpha val="63000"/>
+              </a:srgbClr>
+            </a:outerShdw>
+          </a:effectLst>
+        </a:effectStyle>
+      </a:effectStyleLst>
+      <a:bgFillStyleLst>
+        <a:solidFill>
+          <a:schemeClr val="phClr"/>
+        </a:solidFill>
+        <a:solidFill>
+          <a:schemeClr val="phClr">
+            <a:tint val="95000"/>
+            <a:satMod val="170000"/>
+          </a:schemeClr>
+        </a:solidFill>
+        <a:gradFill rotWithShape="true">
+          <a:gsLst>
+            <a:gs pos="0">
+              <a:schemeClr val="phClr">
+                <a:tint val="93000"/>
+                <a:satMod val="150000"/>
+                <a:shade val="98000"/>
+                <a:lumMod val="102000"/>
+              </a:schemeClr>
+            </a:gs>
+            <a:gs pos="50000">
+              <a:schemeClr val="phClr">
+                <a:tint val="98000"/>
+                <a:satMod val="130000"/>
+                <a:shade val="90000"/>
+                <a:lumMod val="103000"/>
+              </a:schemeClr>
+            </a:gs>
+            <a:gs pos="100000">
+              <a:schemeClr val="phClr">
+                <a:shade val="63000"/>
+                <a:satMod val="120000"/>
+              </a:schemeClr>
+            </a:gs>
+          </a:gsLst>
+          <a:lin ang="5400000" scaled="false"/>
+        </a:gradFill>
+      </a:bgFillStyleLst>
+    </a:fmtScheme>
+  </a:themeElements>
+  <a:objectDefaults/>
+  <a:extraClrSchemeLst/>
+</a:theme>
 </file>
</xml_diff>